<commit_message>
feat: add credit card default EDA notebook, PDF report, and Word document report
</commit_message>
<xml_diff>
--- a/report/EDA_Credit_Card_Default_Report.docx
+++ b/report/EDA_Credit_Card_Default_Report.docx
@@ -104,6 +104,7 @@
           </w:tcPr>
           <w:p>
             <w:pPr>
+              <w:keepNext/>
               <w:spacing w:after="20" w:line="240" w:lineRule="auto"/>
             </w:pPr>
             <w:r>
@@ -131,6 +132,7 @@
           </w:tcPr>
           <w:p>
             <w:pPr>
+              <w:keepNext/>
               <w:spacing w:after="20" w:line="240" w:lineRule="auto"/>
             </w:pPr>
             <w:r>
@@ -162,6 +164,7 @@
           </w:tcPr>
           <w:p>
             <w:pPr>
+              <w:keepNext/>
               <w:spacing w:after="20" w:line="240" w:lineRule="auto"/>
             </w:pPr>
             <w:r>
@@ -184,6 +187,7 @@
           </w:tcPr>
           <w:p>
             <w:pPr>
+              <w:keepNext/>
               <w:spacing w:after="20" w:line="240" w:lineRule="auto"/>
             </w:pPr>
             <w:r>
@@ -212,6 +216,7 @@
           </w:tcPr>
           <w:p>
             <w:pPr>
+              <w:keepNext/>
               <w:spacing w:after="20" w:line="240" w:lineRule="auto"/>
             </w:pPr>
             <w:r>
@@ -235,6 +240,7 @@
           </w:tcPr>
           <w:p>
             <w:pPr>
+              <w:keepNext/>
               <w:spacing w:after="20" w:line="240" w:lineRule="auto"/>
             </w:pPr>
             <w:r>
@@ -262,6 +268,7 @@
           </w:tcPr>
           <w:p>
             <w:pPr>
+              <w:keepNext/>
               <w:spacing w:after="20" w:line="240" w:lineRule="auto"/>
             </w:pPr>
             <w:r>
@@ -284,6 +291,7 @@
           </w:tcPr>
           <w:p>
             <w:pPr>
+              <w:keepNext/>
               <w:spacing w:after="20" w:line="240" w:lineRule="auto"/>
             </w:pPr>
             <w:r>
@@ -312,6 +320,7 @@
           </w:tcPr>
           <w:p>
             <w:pPr>
+              <w:keepNext/>
               <w:spacing w:after="20" w:line="240" w:lineRule="auto"/>
             </w:pPr>
             <w:r>
@@ -335,6 +344,7 @@
           </w:tcPr>
           <w:p>
             <w:pPr>
+              <w:keepNext/>
               <w:spacing w:after="20" w:line="240" w:lineRule="auto"/>
             </w:pPr>
             <w:r>
@@ -362,6 +372,7 @@
           </w:tcPr>
           <w:p>
             <w:pPr>
+              <w:keepNext/>
               <w:spacing w:after="20" w:line="240" w:lineRule="auto"/>
             </w:pPr>
             <w:r>
@@ -384,6 +395,7 @@
           </w:tcPr>
           <w:p>
             <w:pPr>
+              <w:keepNext/>
               <w:spacing w:after="20" w:line="240" w:lineRule="auto"/>
             </w:pPr>
             <w:r>
@@ -412,6 +424,7 @@
           </w:tcPr>
           <w:p>
             <w:pPr>
+              <w:keepNext/>
               <w:spacing w:after="20" w:line="240" w:lineRule="auto"/>
             </w:pPr>
             <w:r>
@@ -435,6 +448,7 @@
           </w:tcPr>
           <w:p>
             <w:pPr>
+              <w:keepNext/>
               <w:spacing w:after="20" w:line="240" w:lineRule="auto"/>
             </w:pPr>
             <w:r>
@@ -819,6 +833,7 @@
           </w:tcPr>
           <w:p>
             <w:pPr>
+              <w:keepNext/>
               <w:spacing w:after="20" w:line="240" w:lineRule="auto"/>
             </w:pPr>
             <w:r>
@@ -844,6 +859,7 @@
           </w:tcPr>
           <w:p>
             <w:pPr>
+              <w:keepNext/>
               <w:spacing w:after="20" w:line="240" w:lineRule="auto"/>
             </w:pPr>
             <w:r>
@@ -873,6 +889,7 @@
           </w:tcPr>
           <w:p>
             <w:pPr>
+              <w:keepNext/>
               <w:spacing w:after="20" w:line="240" w:lineRule="auto"/>
             </w:pPr>
             <w:r/>
@@ -890,6 +907,7 @@
           </w:tcPr>
           <w:p>
             <w:pPr>
+              <w:keepNext/>
               <w:spacing w:after="20" w:line="240" w:lineRule="auto"/>
             </w:pPr>
             <w:r/>
@@ -913,6 +931,7 @@
           </w:tcPr>
           <w:p>
             <w:pPr>
+              <w:keepNext/>
               <w:spacing w:after="20" w:line="240" w:lineRule="auto"/>
             </w:pPr>
             <w:r/>
@@ -931,6 +950,7 @@
           </w:tcPr>
           <w:p>
             <w:pPr>
+              <w:keepNext/>
               <w:spacing w:after="20" w:line="240" w:lineRule="auto"/>
             </w:pPr>
             <w:r/>
@@ -953,6 +973,7 @@
           </w:tcPr>
           <w:p>
             <w:pPr>
+              <w:keepNext/>
               <w:spacing w:after="20" w:line="240" w:lineRule="auto"/>
             </w:pPr>
             <w:r/>
@@ -970,6 +991,7 @@
           </w:tcPr>
           <w:p>
             <w:pPr>
+              <w:keepNext/>
               <w:spacing w:after="20" w:line="240" w:lineRule="auto"/>
             </w:pPr>
             <w:r/>
@@ -993,6 +1015,7 @@
           </w:tcPr>
           <w:p>
             <w:pPr>
+              <w:keepNext/>
               <w:spacing w:after="20" w:line="240" w:lineRule="auto"/>
             </w:pPr>
             <w:r/>
@@ -1011,6 +1034,7 @@
           </w:tcPr>
           <w:p>
             <w:pPr>
+              <w:keepNext/>
               <w:spacing w:after="20" w:line="240" w:lineRule="auto"/>
             </w:pPr>
             <w:r/>
@@ -1033,6 +1057,7 @@
           </w:tcPr>
           <w:p>
             <w:pPr>
+              <w:keepNext/>
               <w:spacing w:after="20" w:line="240" w:lineRule="auto"/>
             </w:pPr>
             <w:r/>
@@ -1050,6 +1075,7 @@
           </w:tcPr>
           <w:p>
             <w:pPr>
+              <w:keepNext/>
               <w:spacing w:after="20" w:line="240" w:lineRule="auto"/>
             </w:pPr>
             <w:r/>
@@ -1073,6 +1099,7 @@
           </w:tcPr>
           <w:p>
             <w:pPr>
+              <w:keepNext/>
               <w:spacing w:after="20" w:line="240" w:lineRule="auto"/>
             </w:pPr>
             <w:r/>
@@ -1091,6 +1118,7 @@
           </w:tcPr>
           <w:p>
             <w:pPr>
+              <w:keepNext/>
               <w:spacing w:after="20" w:line="240" w:lineRule="auto"/>
             </w:pPr>
             <w:r/>
@@ -1113,6 +1141,7 @@
           </w:tcPr>
           <w:p>
             <w:pPr>
+              <w:keepNext/>
               <w:spacing w:after="20" w:line="240" w:lineRule="auto"/>
             </w:pPr>
             <w:r/>
@@ -1130,6 +1159,7 @@
           </w:tcPr>
           <w:p>
             <w:pPr>
+              <w:keepNext/>
               <w:spacing w:after="20" w:line="240" w:lineRule="auto"/>
             </w:pPr>
             <w:r/>
@@ -1221,6 +1251,7 @@
           </w:tcPr>
           <w:p>
             <w:pPr>
+              <w:keepNext/>
               <w:spacing w:after="20" w:line="240" w:lineRule="auto"/>
             </w:pPr>
             <w:r>
@@ -1246,6 +1277,7 @@
           </w:tcPr>
           <w:p>
             <w:pPr>
+              <w:keepNext/>
               <w:spacing w:after="20" w:line="240" w:lineRule="auto"/>
             </w:pPr>
             <w:r>
@@ -1271,6 +1303,7 @@
           </w:tcPr>
           <w:p>
             <w:pPr>
+              <w:keepNext/>
               <w:spacing w:after="20" w:line="240" w:lineRule="auto"/>
             </w:pPr>
             <w:r>
@@ -1300,6 +1333,7 @@
           </w:tcPr>
           <w:p>
             <w:pPr>
+              <w:keepNext/>
               <w:spacing w:after="20" w:line="240" w:lineRule="auto"/>
             </w:pPr>
             <w:r/>
@@ -1317,6 +1351,7 @@
           </w:tcPr>
           <w:p>
             <w:pPr>
+              <w:keepNext/>
               <w:spacing w:after="20" w:line="240" w:lineRule="auto"/>
             </w:pPr>
             <w:r/>
@@ -1334,6 +1369,7 @@
           </w:tcPr>
           <w:p>
             <w:pPr>
+              <w:keepNext/>
               <w:spacing w:after="20" w:line="240" w:lineRule="auto"/>
             </w:pPr>
             <w:r/>
@@ -1357,6 +1393,7 @@
           </w:tcPr>
           <w:p>
             <w:pPr>
+              <w:keepNext/>
               <w:spacing w:after="20" w:line="240" w:lineRule="auto"/>
             </w:pPr>
             <w:r/>
@@ -1375,6 +1412,7 @@
           </w:tcPr>
           <w:p>
             <w:pPr>
+              <w:keepNext/>
               <w:spacing w:after="20" w:line="240" w:lineRule="auto"/>
             </w:pPr>
             <w:r/>
@@ -1393,6 +1431,7 @@
           </w:tcPr>
           <w:p>
             <w:pPr>
+              <w:keepNext/>
               <w:spacing w:after="20" w:line="240" w:lineRule="auto"/>
             </w:pPr>
             <w:r/>
@@ -1415,6 +1454,7 @@
           </w:tcPr>
           <w:p>
             <w:pPr>
+              <w:keepNext/>
               <w:spacing w:after="20" w:line="240" w:lineRule="auto"/>
             </w:pPr>
             <w:r/>
@@ -1432,6 +1472,7 @@
           </w:tcPr>
           <w:p>
             <w:pPr>
+              <w:keepNext/>
               <w:spacing w:after="20" w:line="240" w:lineRule="auto"/>
             </w:pPr>
             <w:r/>
@@ -1449,6 +1490,7 @@
           </w:tcPr>
           <w:p>
             <w:pPr>
+              <w:keepNext/>
               <w:spacing w:after="20" w:line="240" w:lineRule="auto"/>
             </w:pPr>
             <w:r/>
@@ -1472,6 +1514,7 @@
           </w:tcPr>
           <w:p>
             <w:pPr>
+              <w:keepNext/>
               <w:spacing w:after="20" w:line="240" w:lineRule="auto"/>
             </w:pPr>
             <w:r/>
@@ -1490,6 +1533,7 @@
           </w:tcPr>
           <w:p>
             <w:pPr>
+              <w:keepNext/>
               <w:spacing w:after="20" w:line="240" w:lineRule="auto"/>
             </w:pPr>
             <w:r/>
@@ -1508,6 +1552,7 @@
           </w:tcPr>
           <w:p>
             <w:pPr>
+              <w:keepNext/>
               <w:spacing w:after="20" w:line="240" w:lineRule="auto"/>
             </w:pPr>
             <w:r/>
@@ -1530,6 +1575,7 @@
           </w:tcPr>
           <w:p>
             <w:pPr>
+              <w:keepNext/>
               <w:spacing w:after="20" w:line="240" w:lineRule="auto"/>
             </w:pPr>
             <w:r/>
@@ -1547,6 +1593,7 @@
           </w:tcPr>
           <w:p>
             <w:pPr>
+              <w:keepNext/>
               <w:spacing w:after="20" w:line="240" w:lineRule="auto"/>
             </w:pPr>
             <w:r/>
@@ -1564,6 +1611,7 @@
           </w:tcPr>
           <w:p>
             <w:pPr>
+              <w:keepNext/>
               <w:spacing w:after="20" w:line="240" w:lineRule="auto"/>
             </w:pPr>
             <w:r/>
@@ -1683,6 +1731,7 @@
           </w:tcPr>
           <w:p>
             <w:pPr>
+              <w:keepNext/>
               <w:spacing w:after="20" w:line="240" w:lineRule="auto"/>
             </w:pPr>
             <w:r>
@@ -1708,6 +1757,7 @@
           </w:tcPr>
           <w:p>
             <w:pPr>
+              <w:keepNext/>
               <w:spacing w:after="20" w:line="240" w:lineRule="auto"/>
             </w:pPr>
             <w:r>
@@ -1733,6 +1783,7 @@
           </w:tcPr>
           <w:p>
             <w:pPr>
+              <w:keepNext/>
               <w:spacing w:after="20" w:line="240" w:lineRule="auto"/>
             </w:pPr>
             <w:r>
@@ -1758,6 +1809,7 @@
           </w:tcPr>
           <w:p>
             <w:pPr>
+              <w:keepNext/>
               <w:spacing w:after="20" w:line="240" w:lineRule="auto"/>
             </w:pPr>
             <w:r>
@@ -1783,6 +1835,7 @@
           </w:tcPr>
           <w:p>
             <w:pPr>
+              <w:keepNext/>
               <w:spacing w:after="20" w:line="240" w:lineRule="auto"/>
             </w:pPr>
             <w:r>
@@ -1812,6 +1865,7 @@
           </w:tcPr>
           <w:p>
             <w:pPr>
+              <w:keepNext/>
               <w:spacing w:after="20" w:line="240" w:lineRule="auto"/>
             </w:pPr>
             <w:r/>
@@ -1829,6 +1883,7 @@
           </w:tcPr>
           <w:p>
             <w:pPr>
+              <w:keepNext/>
               <w:spacing w:after="20" w:line="240" w:lineRule="auto"/>
             </w:pPr>
             <w:r/>
@@ -1846,6 +1901,7 @@
           </w:tcPr>
           <w:p>
             <w:pPr>
+              <w:keepNext/>
               <w:spacing w:after="20" w:line="240" w:lineRule="auto"/>
             </w:pPr>
             <w:r/>
@@ -1863,6 +1919,7 @@
           </w:tcPr>
           <w:p>
             <w:pPr>
+              <w:keepNext/>
               <w:spacing w:after="20" w:line="240" w:lineRule="auto"/>
             </w:pPr>
             <w:r/>
@@ -1880,6 +1937,7 @@
           </w:tcPr>
           <w:p>
             <w:pPr>
+              <w:keepNext/>
               <w:spacing w:after="20" w:line="240" w:lineRule="auto"/>
             </w:pPr>
             <w:r/>
@@ -1903,6 +1961,7 @@
           </w:tcPr>
           <w:p>
             <w:pPr>
+              <w:keepNext/>
               <w:spacing w:after="20" w:line="240" w:lineRule="auto"/>
             </w:pPr>
             <w:r/>
@@ -1921,6 +1980,7 @@
           </w:tcPr>
           <w:p>
             <w:pPr>
+              <w:keepNext/>
               <w:spacing w:after="20" w:line="240" w:lineRule="auto"/>
             </w:pPr>
             <w:r/>
@@ -1939,6 +1999,7 @@
           </w:tcPr>
           <w:p>
             <w:pPr>
+              <w:keepNext/>
               <w:spacing w:after="20" w:line="240" w:lineRule="auto"/>
             </w:pPr>
             <w:r/>
@@ -1957,6 +2018,7 @@
           </w:tcPr>
           <w:p>
             <w:pPr>
+              <w:keepNext/>
               <w:spacing w:after="20" w:line="240" w:lineRule="auto"/>
             </w:pPr>
             <w:r/>
@@ -1975,6 +2037,7 @@
           </w:tcPr>
           <w:p>
             <w:pPr>
+              <w:keepNext/>
               <w:spacing w:after="20" w:line="240" w:lineRule="auto"/>
             </w:pPr>
             <w:r/>
@@ -1997,6 +2060,7 @@
           </w:tcPr>
           <w:p>
             <w:pPr>
+              <w:keepNext/>
               <w:spacing w:after="20" w:line="240" w:lineRule="auto"/>
             </w:pPr>
             <w:r/>
@@ -2014,6 +2078,7 @@
           </w:tcPr>
           <w:p>
             <w:pPr>
+              <w:keepNext/>
               <w:spacing w:after="20" w:line="240" w:lineRule="auto"/>
             </w:pPr>
             <w:r/>
@@ -2031,6 +2096,7 @@
           </w:tcPr>
           <w:p>
             <w:pPr>
+              <w:keepNext/>
               <w:spacing w:after="20" w:line="240" w:lineRule="auto"/>
             </w:pPr>
             <w:r/>
@@ -2048,6 +2114,7 @@
           </w:tcPr>
           <w:p>
             <w:pPr>
+              <w:keepNext/>
               <w:spacing w:after="20" w:line="240" w:lineRule="auto"/>
             </w:pPr>
             <w:r/>
@@ -2065,6 +2132,7 @@
           </w:tcPr>
           <w:p>
             <w:pPr>
+              <w:keepNext/>
               <w:spacing w:after="20" w:line="240" w:lineRule="auto"/>
             </w:pPr>
             <w:r/>
@@ -2088,6 +2156,7 @@
           </w:tcPr>
           <w:p>
             <w:pPr>
+              <w:keepNext/>
               <w:spacing w:after="20" w:line="240" w:lineRule="auto"/>
             </w:pPr>
             <w:r/>
@@ -2106,6 +2175,7 @@
           </w:tcPr>
           <w:p>
             <w:pPr>
+              <w:keepNext/>
               <w:spacing w:after="20" w:line="240" w:lineRule="auto"/>
             </w:pPr>
             <w:r/>
@@ -2124,6 +2194,7 @@
           </w:tcPr>
           <w:p>
             <w:pPr>
+              <w:keepNext/>
               <w:spacing w:after="20" w:line="240" w:lineRule="auto"/>
             </w:pPr>
             <w:r/>
@@ -2142,6 +2213,7 @@
           </w:tcPr>
           <w:p>
             <w:pPr>
+              <w:keepNext/>
               <w:spacing w:after="20" w:line="240" w:lineRule="auto"/>
             </w:pPr>
             <w:r/>
@@ -2160,6 +2232,7 @@
           </w:tcPr>
           <w:p>
             <w:pPr>
+              <w:keepNext/>
               <w:spacing w:after="20" w:line="240" w:lineRule="auto"/>
             </w:pPr>
             <w:r/>
@@ -2182,6 +2255,7 @@
           </w:tcPr>
           <w:p>
             <w:pPr>
+              <w:keepNext/>
               <w:spacing w:after="20" w:line="240" w:lineRule="auto"/>
             </w:pPr>
             <w:r/>
@@ -2199,6 +2273,7 @@
           </w:tcPr>
           <w:p>
             <w:pPr>
+              <w:keepNext/>
               <w:spacing w:after="20" w:line="240" w:lineRule="auto"/>
             </w:pPr>
             <w:r/>
@@ -2216,6 +2291,7 @@
           </w:tcPr>
           <w:p>
             <w:pPr>
+              <w:keepNext/>
               <w:spacing w:after="20" w:line="240" w:lineRule="auto"/>
             </w:pPr>
             <w:r/>
@@ -2233,6 +2309,7 @@
           </w:tcPr>
           <w:p>
             <w:pPr>
+              <w:keepNext/>
               <w:spacing w:after="20" w:line="240" w:lineRule="auto"/>
             </w:pPr>
             <w:r/>
@@ -2250,6 +2327,7 @@
           </w:tcPr>
           <w:p>
             <w:pPr>
+              <w:keepNext/>
               <w:spacing w:after="20" w:line="240" w:lineRule="auto"/>
             </w:pPr>
             <w:r/>
@@ -2273,6 +2351,7 @@
           </w:tcPr>
           <w:p>
             <w:pPr>
+              <w:keepNext/>
               <w:spacing w:after="20" w:line="240" w:lineRule="auto"/>
             </w:pPr>
             <w:r/>
@@ -2291,6 +2370,7 @@
           </w:tcPr>
           <w:p>
             <w:pPr>
+              <w:keepNext/>
               <w:spacing w:after="20" w:line="240" w:lineRule="auto"/>
             </w:pPr>
             <w:r/>
@@ -2309,6 +2389,7 @@
           </w:tcPr>
           <w:p>
             <w:pPr>
+              <w:keepNext/>
               <w:spacing w:after="20" w:line="240" w:lineRule="auto"/>
             </w:pPr>
             <w:r/>
@@ -2327,6 +2408,7 @@
           </w:tcPr>
           <w:p>
             <w:pPr>
+              <w:keepNext/>
               <w:spacing w:after="20" w:line="240" w:lineRule="auto"/>
             </w:pPr>
             <w:r/>
@@ -2345,6 +2427,7 @@
           </w:tcPr>
           <w:p>
             <w:pPr>
+              <w:keepNext/>
               <w:spacing w:after="20" w:line="240" w:lineRule="auto"/>
             </w:pPr>
             <w:r/>
@@ -2367,6 +2450,7 @@
           </w:tcPr>
           <w:p>
             <w:pPr>
+              <w:keepNext/>
               <w:spacing w:after="20" w:line="240" w:lineRule="auto"/>
             </w:pPr>
             <w:r/>
@@ -2384,6 +2468,7 @@
           </w:tcPr>
           <w:p>
             <w:pPr>
+              <w:keepNext/>
               <w:spacing w:after="20" w:line="240" w:lineRule="auto"/>
             </w:pPr>
             <w:r/>
@@ -2401,6 +2486,7 @@
           </w:tcPr>
           <w:p>
             <w:pPr>
+              <w:keepNext/>
               <w:spacing w:after="20" w:line="240" w:lineRule="auto"/>
             </w:pPr>
             <w:r/>
@@ -2418,6 +2504,7 @@
           </w:tcPr>
           <w:p>
             <w:pPr>
+              <w:keepNext/>
               <w:spacing w:after="20" w:line="240" w:lineRule="auto"/>
             </w:pPr>
             <w:r/>
@@ -2435,6 +2522,7 @@
           </w:tcPr>
           <w:p>
             <w:pPr>
+              <w:keepNext/>
               <w:spacing w:after="20" w:line="240" w:lineRule="auto"/>
             </w:pPr>
             <w:r/>
@@ -2682,6 +2770,7 @@
           </w:tcPr>
           <w:p>
             <w:pPr>
+              <w:keepNext/>
               <w:spacing w:after="20" w:line="240" w:lineRule="auto"/>
             </w:pPr>
             <w:r>
@@ -2707,6 +2796,7 @@
           </w:tcPr>
           <w:p>
             <w:pPr>
+              <w:keepNext/>
               <w:spacing w:after="20" w:line="240" w:lineRule="auto"/>
             </w:pPr>
             <w:r>
@@ -2732,6 +2822,7 @@
           </w:tcPr>
           <w:p>
             <w:pPr>
+              <w:keepNext/>
               <w:spacing w:after="20" w:line="240" w:lineRule="auto"/>
             </w:pPr>
             <w:r>
@@ -2761,6 +2852,7 @@
           </w:tcPr>
           <w:p>
             <w:pPr>
+              <w:keepNext/>
               <w:spacing w:after="20" w:line="240" w:lineRule="auto"/>
             </w:pPr>
             <w:r/>
@@ -2778,6 +2870,7 @@
           </w:tcPr>
           <w:p>
             <w:pPr>
+              <w:keepNext/>
               <w:spacing w:after="20" w:line="240" w:lineRule="auto"/>
             </w:pPr>
             <w:r/>
@@ -2795,6 +2888,7 @@
           </w:tcPr>
           <w:p>
             <w:pPr>
+              <w:keepNext/>
               <w:spacing w:after="20" w:line="240" w:lineRule="auto"/>
             </w:pPr>
             <w:r/>
@@ -2885,7 +2979,7 @@
         <w:jc w:val="both"/>
       </w:pPr>
       <w:r>
-        <w:t xml:space="preserve">Outliers were identified with the 1.5 × IQR rule. every bill and payment column has roughly </w:t>
+        <w:t xml:space="preserve">Outliers were identified with the 1.5 × IQR rule. Every bill and payment column has roughly </w:t>
       </w:r>
       <w:r>
         <w:rPr>
@@ -2931,6 +3025,7 @@
           </w:tcPr>
           <w:p>
             <w:pPr>
+              <w:keepNext/>
               <w:spacing w:after="20" w:line="240" w:lineRule="auto"/>
             </w:pPr>
             <w:r>
@@ -2956,6 +3051,7 @@
           </w:tcPr>
           <w:p>
             <w:pPr>
+              <w:keepNext/>
               <w:spacing w:after="20" w:line="240" w:lineRule="auto"/>
             </w:pPr>
             <w:r>
@@ -2981,6 +3077,7 @@
           </w:tcPr>
           <w:p>
             <w:pPr>
+              <w:keepNext/>
               <w:spacing w:after="20" w:line="240" w:lineRule="auto"/>
             </w:pPr>
             <w:r>
@@ -3006,6 +3103,7 @@
           </w:tcPr>
           <w:p>
             <w:pPr>
+              <w:keepNext/>
               <w:spacing w:after="20" w:line="240" w:lineRule="auto"/>
             </w:pPr>
             <w:r>
@@ -3035,6 +3133,7 @@
           </w:tcPr>
           <w:p>
             <w:pPr>
+              <w:keepNext/>
               <w:spacing w:after="20" w:line="240" w:lineRule="auto"/>
             </w:pPr>
             <w:r/>
@@ -3052,6 +3151,7 @@
           </w:tcPr>
           <w:p>
             <w:pPr>
+              <w:keepNext/>
               <w:spacing w:after="20" w:line="240" w:lineRule="auto"/>
             </w:pPr>
             <w:r/>
@@ -3069,6 +3169,7 @@
           </w:tcPr>
           <w:p>
             <w:pPr>
+              <w:keepNext/>
               <w:spacing w:after="20" w:line="240" w:lineRule="auto"/>
             </w:pPr>
             <w:r/>
@@ -3086,6 +3187,7 @@
           </w:tcPr>
           <w:p>
             <w:pPr>
+              <w:keepNext/>
               <w:spacing w:after="20" w:line="240" w:lineRule="auto"/>
             </w:pPr>
             <w:r/>
@@ -3109,6 +3211,7 @@
           </w:tcPr>
           <w:p>
             <w:pPr>
+              <w:keepNext/>
               <w:spacing w:after="20" w:line="240" w:lineRule="auto"/>
             </w:pPr>
             <w:r/>
@@ -3127,6 +3230,7 @@
           </w:tcPr>
           <w:p>
             <w:pPr>
+              <w:keepNext/>
               <w:spacing w:after="20" w:line="240" w:lineRule="auto"/>
             </w:pPr>
             <w:r/>
@@ -3145,6 +3249,7 @@
           </w:tcPr>
           <w:p>
             <w:pPr>
+              <w:keepNext/>
               <w:spacing w:after="20" w:line="240" w:lineRule="auto"/>
             </w:pPr>
             <w:r/>
@@ -3163,6 +3268,7 @@
           </w:tcPr>
           <w:p>
             <w:pPr>
+              <w:keepNext/>
               <w:spacing w:after="20" w:line="240" w:lineRule="auto"/>
             </w:pPr>
             <w:r/>
@@ -3185,6 +3291,7 @@
           </w:tcPr>
           <w:p>
             <w:pPr>
+              <w:keepNext/>
               <w:spacing w:after="20" w:line="240" w:lineRule="auto"/>
             </w:pPr>
             <w:r/>
@@ -3202,6 +3309,7 @@
           </w:tcPr>
           <w:p>
             <w:pPr>
+              <w:keepNext/>
               <w:spacing w:after="20" w:line="240" w:lineRule="auto"/>
             </w:pPr>
             <w:r/>
@@ -3219,6 +3327,7 @@
           </w:tcPr>
           <w:p>
             <w:pPr>
+              <w:keepNext/>
               <w:spacing w:after="20" w:line="240" w:lineRule="auto"/>
             </w:pPr>
             <w:r/>
@@ -3236,6 +3345,7 @@
           </w:tcPr>
           <w:p>
             <w:pPr>
+              <w:keepNext/>
               <w:spacing w:after="20" w:line="240" w:lineRule="auto"/>
             </w:pPr>
             <w:r/>
@@ -3259,6 +3369,7 @@
           </w:tcPr>
           <w:p>
             <w:pPr>
+              <w:keepNext/>
               <w:spacing w:after="20" w:line="240" w:lineRule="auto"/>
             </w:pPr>
             <w:r/>
@@ -3277,6 +3388,7 @@
           </w:tcPr>
           <w:p>
             <w:pPr>
+              <w:keepNext/>
               <w:spacing w:after="20" w:line="240" w:lineRule="auto"/>
             </w:pPr>
             <w:r/>
@@ -3295,6 +3407,7 @@
           </w:tcPr>
           <w:p>
             <w:pPr>
+              <w:keepNext/>
               <w:spacing w:after="20" w:line="240" w:lineRule="auto"/>
             </w:pPr>
             <w:r/>
@@ -3313,6 +3426,7 @@
           </w:tcPr>
           <w:p>
             <w:pPr>
+              <w:keepNext/>
               <w:spacing w:after="20" w:line="240" w:lineRule="auto"/>
             </w:pPr>
             <w:r/>
@@ -3335,6 +3449,7 @@
           </w:tcPr>
           <w:p>
             <w:pPr>
+              <w:keepNext/>
               <w:spacing w:after="20" w:line="240" w:lineRule="auto"/>
             </w:pPr>
             <w:r/>
@@ -3352,6 +3467,7 @@
           </w:tcPr>
           <w:p>
             <w:pPr>
+              <w:keepNext/>
               <w:spacing w:after="20" w:line="240" w:lineRule="auto"/>
             </w:pPr>
             <w:r/>
@@ -3369,6 +3485,7 @@
           </w:tcPr>
           <w:p>
             <w:pPr>
+              <w:keepNext/>
               <w:spacing w:after="20" w:line="240" w:lineRule="auto"/>
             </w:pPr>
             <w:r/>
@@ -3386,6 +3503,7 @@
           </w:tcPr>
           <w:p>
             <w:pPr>
+              <w:keepNext/>
               <w:spacing w:after="20" w:line="240" w:lineRule="auto"/>
             </w:pPr>
             <w:r/>
@@ -3409,6 +3527,7 @@
           </w:tcPr>
           <w:p>
             <w:pPr>
+              <w:keepNext/>
               <w:spacing w:after="20" w:line="240" w:lineRule="auto"/>
             </w:pPr>
             <w:r/>
@@ -3427,6 +3546,7 @@
           </w:tcPr>
           <w:p>
             <w:pPr>
+              <w:keepNext/>
               <w:spacing w:after="20" w:line="240" w:lineRule="auto"/>
             </w:pPr>
             <w:r/>
@@ -3445,6 +3565,7 @@
           </w:tcPr>
           <w:p>
             <w:pPr>
+              <w:keepNext/>
               <w:spacing w:after="20" w:line="240" w:lineRule="auto"/>
             </w:pPr>
             <w:r/>
@@ -3463,6 +3584,7 @@
           </w:tcPr>
           <w:p>
             <w:pPr>
+              <w:keepNext/>
               <w:spacing w:after="20" w:line="240" w:lineRule="auto"/>
             </w:pPr>
             <w:r/>
@@ -3485,6 +3607,7 @@
           </w:tcPr>
           <w:p>
             <w:pPr>
+              <w:keepNext/>
               <w:spacing w:after="20" w:line="240" w:lineRule="auto"/>
             </w:pPr>
             <w:r/>
@@ -3502,6 +3625,7 @@
           </w:tcPr>
           <w:p>
             <w:pPr>
+              <w:keepNext/>
               <w:spacing w:after="20" w:line="240" w:lineRule="auto"/>
             </w:pPr>
             <w:r/>
@@ -3519,6 +3643,7 @@
           </w:tcPr>
           <w:p>
             <w:pPr>
+              <w:keepNext/>
               <w:spacing w:after="20" w:line="240" w:lineRule="auto"/>
             </w:pPr>
             <w:r/>
@@ -3536,6 +3661,7 @@
           </w:tcPr>
           <w:p>
             <w:pPr>
+              <w:keepNext/>
               <w:spacing w:after="20" w:line="240" w:lineRule="auto"/>
             </w:pPr>
             <w:r/>
@@ -3559,6 +3685,7 @@
           </w:tcPr>
           <w:p>
             <w:pPr>
+              <w:keepNext/>
               <w:spacing w:after="20" w:line="240" w:lineRule="auto"/>
             </w:pPr>
             <w:r/>
@@ -3577,6 +3704,7 @@
           </w:tcPr>
           <w:p>
             <w:pPr>
+              <w:keepNext/>
               <w:spacing w:after="20" w:line="240" w:lineRule="auto"/>
             </w:pPr>
             <w:r/>
@@ -3595,6 +3723,7 @@
           </w:tcPr>
           <w:p>
             <w:pPr>
+              <w:keepNext/>
               <w:spacing w:after="20" w:line="240" w:lineRule="auto"/>
             </w:pPr>
             <w:r/>
@@ -3613,6 +3742,7 @@
           </w:tcPr>
           <w:p>
             <w:pPr>
+              <w:keepNext/>
               <w:spacing w:after="20" w:line="240" w:lineRule="auto"/>
             </w:pPr>
             <w:r/>
@@ -3635,6 +3765,7 @@
           </w:tcPr>
           <w:p>
             <w:pPr>
+              <w:keepNext/>
               <w:spacing w:after="20" w:line="240" w:lineRule="auto"/>
             </w:pPr>
             <w:r/>
@@ -3652,6 +3783,7 @@
           </w:tcPr>
           <w:p>
             <w:pPr>
+              <w:keepNext/>
               <w:spacing w:after="20" w:line="240" w:lineRule="auto"/>
             </w:pPr>
             <w:r/>
@@ -3669,6 +3801,7 @@
           </w:tcPr>
           <w:p>
             <w:pPr>
+              <w:keepNext/>
               <w:spacing w:after="20" w:line="240" w:lineRule="auto"/>
             </w:pPr>
             <w:r/>
@@ -3686,6 +3819,7 @@
           </w:tcPr>
           <w:p>
             <w:pPr>
+              <w:keepNext/>
               <w:spacing w:after="20" w:line="240" w:lineRule="auto"/>
             </w:pPr>
             <w:r/>
@@ -3709,6 +3843,7 @@
           </w:tcPr>
           <w:p>
             <w:pPr>
+              <w:keepNext/>
               <w:spacing w:after="20" w:line="240" w:lineRule="auto"/>
             </w:pPr>
             <w:r/>
@@ -3727,6 +3862,7 @@
           </w:tcPr>
           <w:p>
             <w:pPr>
+              <w:keepNext/>
               <w:spacing w:after="20" w:line="240" w:lineRule="auto"/>
             </w:pPr>
             <w:r/>
@@ -3745,6 +3881,7 @@
           </w:tcPr>
           <w:p>
             <w:pPr>
+              <w:keepNext/>
               <w:spacing w:after="20" w:line="240" w:lineRule="auto"/>
             </w:pPr>
             <w:r/>
@@ -3763,6 +3900,7 @@
           </w:tcPr>
           <w:p>
             <w:pPr>
+              <w:keepNext/>
               <w:spacing w:after="20" w:line="240" w:lineRule="auto"/>
             </w:pPr>
             <w:r/>
@@ -3785,6 +3923,7 @@
           </w:tcPr>
           <w:p>
             <w:pPr>
+              <w:keepNext/>
               <w:spacing w:after="20" w:line="240" w:lineRule="auto"/>
             </w:pPr>
             <w:r/>
@@ -3802,6 +3941,7 @@
           </w:tcPr>
           <w:p>
             <w:pPr>
+              <w:keepNext/>
               <w:spacing w:after="20" w:line="240" w:lineRule="auto"/>
             </w:pPr>
             <w:r/>
@@ -3819,6 +3959,7 @@
           </w:tcPr>
           <w:p>
             <w:pPr>
+              <w:keepNext/>
               <w:spacing w:after="20" w:line="240" w:lineRule="auto"/>
             </w:pPr>
             <w:r/>
@@ -3836,6 +3977,7 @@
           </w:tcPr>
           <w:p>
             <w:pPr>
+              <w:keepNext/>
               <w:spacing w:after="20" w:line="240" w:lineRule="auto"/>
             </w:pPr>
             <w:r/>
@@ -3859,6 +4001,7 @@
           </w:tcPr>
           <w:p>
             <w:pPr>
+              <w:keepNext/>
               <w:spacing w:after="20" w:line="240" w:lineRule="auto"/>
             </w:pPr>
             <w:r/>
@@ -3877,6 +4020,7 @@
           </w:tcPr>
           <w:p>
             <w:pPr>
+              <w:keepNext/>
               <w:spacing w:after="20" w:line="240" w:lineRule="auto"/>
             </w:pPr>
             <w:r/>
@@ -3895,6 +4039,7 @@
           </w:tcPr>
           <w:p>
             <w:pPr>
+              <w:keepNext/>
               <w:spacing w:after="20" w:line="240" w:lineRule="auto"/>
             </w:pPr>
             <w:r/>
@@ -3913,6 +4058,7 @@
           </w:tcPr>
           <w:p>
             <w:pPr>
+              <w:keepNext/>
               <w:spacing w:after="20" w:line="240" w:lineRule="auto"/>
             </w:pPr>
             <w:r/>
@@ -4017,7 +4163,7 @@
         <w:jc w:val="both"/>
       </w:pPr>
       <w:r>
-        <w:t xml:space="preserve">Domain knowledge from credit-risk analysis was used to create six features. credit-risk practice looks at </w:t>
+        <w:t xml:space="preserve">Domain knowledge from credit-risk analysis was used to create six features. Credit-risk practice looks at </w:t>
       </w:r>
       <w:r>
         <w:rPr>
@@ -4071,6 +4217,7 @@
           </w:tcPr>
           <w:p>
             <w:pPr>
+              <w:keepNext/>
               <w:spacing w:after="20" w:line="240" w:lineRule="auto"/>
             </w:pPr>
             <w:r>
@@ -4096,6 +4243,7 @@
           </w:tcPr>
           <w:p>
             <w:pPr>
+              <w:keepNext/>
               <w:spacing w:after="20" w:line="240" w:lineRule="auto"/>
             </w:pPr>
             <w:r>
@@ -4121,6 +4269,7 @@
           </w:tcPr>
           <w:p>
             <w:pPr>
+              <w:keepNext/>
               <w:spacing w:after="20" w:line="240" w:lineRule="auto"/>
             </w:pPr>
             <w:r>
@@ -4150,6 +4299,7 @@
           </w:tcPr>
           <w:p>
             <w:pPr>
+              <w:keepNext/>
               <w:spacing w:after="20" w:line="240" w:lineRule="auto"/>
             </w:pPr>
             <w:r/>
@@ -4167,6 +4317,7 @@
           </w:tcPr>
           <w:p>
             <w:pPr>
+              <w:keepNext/>
               <w:spacing w:after="20" w:line="240" w:lineRule="auto"/>
             </w:pPr>
             <w:r/>
@@ -4184,6 +4335,7 @@
           </w:tcPr>
           <w:p>
             <w:pPr>
+              <w:keepNext/>
               <w:spacing w:after="20" w:line="240" w:lineRule="auto"/>
             </w:pPr>
             <w:r/>
@@ -4207,6 +4359,7 @@
           </w:tcPr>
           <w:p>
             <w:pPr>
+              <w:keepNext/>
               <w:spacing w:after="20" w:line="240" w:lineRule="auto"/>
             </w:pPr>
             <w:r/>
@@ -4225,6 +4378,7 @@
           </w:tcPr>
           <w:p>
             <w:pPr>
+              <w:keepNext/>
               <w:spacing w:after="20" w:line="240" w:lineRule="auto"/>
             </w:pPr>
             <w:r/>
@@ -4243,6 +4397,7 @@
           </w:tcPr>
           <w:p>
             <w:pPr>
+              <w:keepNext/>
               <w:spacing w:after="20" w:line="240" w:lineRule="auto"/>
             </w:pPr>
             <w:r/>
@@ -4265,6 +4420,7 @@
           </w:tcPr>
           <w:p>
             <w:pPr>
+              <w:keepNext/>
               <w:spacing w:after="20" w:line="240" w:lineRule="auto"/>
             </w:pPr>
             <w:r/>
@@ -4282,6 +4438,7 @@
           </w:tcPr>
           <w:p>
             <w:pPr>
+              <w:keepNext/>
               <w:spacing w:after="20" w:line="240" w:lineRule="auto"/>
             </w:pPr>
             <w:r/>
@@ -4299,6 +4456,7 @@
           </w:tcPr>
           <w:p>
             <w:pPr>
+              <w:keepNext/>
               <w:spacing w:after="20" w:line="240" w:lineRule="auto"/>
             </w:pPr>
             <w:r/>
@@ -4322,6 +4480,7 @@
           </w:tcPr>
           <w:p>
             <w:pPr>
+              <w:keepNext/>
               <w:spacing w:after="20" w:line="240" w:lineRule="auto"/>
             </w:pPr>
             <w:r/>
@@ -4340,6 +4499,7 @@
           </w:tcPr>
           <w:p>
             <w:pPr>
+              <w:keepNext/>
               <w:spacing w:after="20" w:line="240" w:lineRule="auto"/>
             </w:pPr>
             <w:r/>
@@ -4358,6 +4518,7 @@
           </w:tcPr>
           <w:p>
             <w:pPr>
+              <w:keepNext/>
               <w:spacing w:after="20" w:line="240" w:lineRule="auto"/>
             </w:pPr>
             <w:r/>
@@ -4380,6 +4541,7 @@
           </w:tcPr>
           <w:p>
             <w:pPr>
+              <w:keepNext/>
               <w:spacing w:after="20" w:line="240" w:lineRule="auto"/>
             </w:pPr>
             <w:r/>
@@ -4397,6 +4559,7 @@
           </w:tcPr>
           <w:p>
             <w:pPr>
+              <w:keepNext/>
               <w:spacing w:after="20" w:line="240" w:lineRule="auto"/>
             </w:pPr>
             <w:r/>
@@ -4414,6 +4577,7 @@
           </w:tcPr>
           <w:p>
             <w:pPr>
+              <w:keepNext/>
               <w:spacing w:after="20" w:line="240" w:lineRule="auto"/>
             </w:pPr>
             <w:r/>
@@ -4612,6 +4776,7 @@
           </w:tcPr>
           <w:p>
             <w:pPr>
+              <w:keepNext/>
               <w:spacing w:after="20" w:line="240" w:lineRule="auto"/>
             </w:pPr>
             <w:r>
@@ -4637,6 +4802,7 @@
           </w:tcPr>
           <w:p>
             <w:pPr>
+              <w:keepNext/>
               <w:spacing w:after="20" w:line="240" w:lineRule="auto"/>
             </w:pPr>
             <w:r>
@@ -4662,6 +4828,7 @@
           </w:tcPr>
           <w:p>
             <w:pPr>
+              <w:keepNext/>
               <w:spacing w:after="20" w:line="240" w:lineRule="auto"/>
             </w:pPr>
             <w:r>
@@ -4687,6 +4854,7 @@
           </w:tcPr>
           <w:p>
             <w:pPr>
+              <w:keepNext/>
               <w:spacing w:after="20" w:line="240" w:lineRule="auto"/>
             </w:pPr>
             <w:r>
@@ -4716,6 +4884,7 @@
           </w:tcPr>
           <w:p>
             <w:pPr>
+              <w:keepNext/>
               <w:spacing w:after="20" w:line="240" w:lineRule="auto"/>
             </w:pPr>
             <w:r/>
@@ -4733,6 +4902,7 @@
           </w:tcPr>
           <w:p>
             <w:pPr>
+              <w:keepNext/>
               <w:spacing w:after="20" w:line="240" w:lineRule="auto"/>
             </w:pPr>
             <w:r/>
@@ -4750,6 +4920,7 @@
           </w:tcPr>
           <w:p>
             <w:pPr>
+              <w:keepNext/>
               <w:spacing w:after="20" w:line="240" w:lineRule="auto"/>
             </w:pPr>
             <w:r/>
@@ -4767,6 +4938,7 @@
           </w:tcPr>
           <w:p>
             <w:pPr>
+              <w:keepNext/>
               <w:spacing w:after="20" w:line="240" w:lineRule="auto"/>
             </w:pPr>
             <w:r/>
@@ -4790,6 +4962,7 @@
           </w:tcPr>
           <w:p>
             <w:pPr>
+              <w:keepNext/>
               <w:spacing w:after="20" w:line="240" w:lineRule="auto"/>
             </w:pPr>
             <w:r/>
@@ -4808,6 +4981,7 @@
           </w:tcPr>
           <w:p>
             <w:pPr>
+              <w:keepNext/>
               <w:spacing w:after="20" w:line="240" w:lineRule="auto"/>
             </w:pPr>
             <w:r/>
@@ -4826,6 +5000,7 @@
           </w:tcPr>
           <w:p>
             <w:pPr>
+              <w:keepNext/>
               <w:spacing w:after="20" w:line="240" w:lineRule="auto"/>
             </w:pPr>
             <w:r/>
@@ -4844,6 +5019,7 @@
           </w:tcPr>
           <w:p>
             <w:pPr>
+              <w:keepNext/>
               <w:spacing w:after="20" w:line="240" w:lineRule="auto"/>
             </w:pPr>
             <w:r/>
@@ -5009,6 +5185,7 @@
           </w:tcPr>
           <w:p>
             <w:pPr>
+              <w:keepNext/>
               <w:spacing w:after="20" w:line="240" w:lineRule="auto"/>
             </w:pPr>
             <w:r>
@@ -5034,6 +5211,7 @@
           </w:tcPr>
           <w:p>
             <w:pPr>
+              <w:keepNext/>
               <w:spacing w:after="20" w:line="240" w:lineRule="auto"/>
             </w:pPr>
             <w:r>
@@ -5063,6 +5241,7 @@
           </w:tcPr>
           <w:p>
             <w:pPr>
+              <w:keepNext/>
               <w:spacing w:after="20" w:line="240" w:lineRule="auto"/>
             </w:pPr>
             <w:r/>
@@ -5080,6 +5259,7 @@
           </w:tcPr>
           <w:p>
             <w:pPr>
+              <w:keepNext/>
               <w:spacing w:after="20" w:line="240" w:lineRule="auto"/>
             </w:pPr>
             <w:r/>
@@ -5103,6 +5283,7 @@
           </w:tcPr>
           <w:p>
             <w:pPr>
+              <w:keepNext/>
               <w:spacing w:after="20" w:line="240" w:lineRule="auto"/>
             </w:pPr>
             <w:r/>
@@ -5121,6 +5302,7 @@
           </w:tcPr>
           <w:p>
             <w:pPr>
+              <w:keepNext/>
               <w:spacing w:after="20" w:line="240" w:lineRule="auto"/>
             </w:pPr>
             <w:r/>
@@ -5143,6 +5325,7 @@
           </w:tcPr>
           <w:p>
             <w:pPr>
+              <w:keepNext/>
               <w:spacing w:after="20" w:line="240" w:lineRule="auto"/>
             </w:pPr>
             <w:r/>
@@ -5160,6 +5343,7 @@
           </w:tcPr>
           <w:p>
             <w:pPr>
+              <w:keepNext/>
               <w:spacing w:after="20" w:line="240" w:lineRule="auto"/>
             </w:pPr>
             <w:r/>
@@ -5183,6 +5367,7 @@
           </w:tcPr>
           <w:p>
             <w:pPr>
+              <w:keepNext/>
               <w:spacing w:after="20" w:line="240" w:lineRule="auto"/>
             </w:pPr>
             <w:r/>
@@ -5201,6 +5386,7 @@
           </w:tcPr>
           <w:p>
             <w:pPr>
+              <w:keepNext/>
               <w:spacing w:after="20" w:line="240" w:lineRule="auto"/>
             </w:pPr>
             <w:r/>
@@ -5223,6 +5409,7 @@
           </w:tcPr>
           <w:p>
             <w:pPr>
+              <w:keepNext/>
               <w:spacing w:after="20" w:line="240" w:lineRule="auto"/>
             </w:pPr>
             <w:r/>
@@ -5240,6 +5427,7 @@
           </w:tcPr>
           <w:p>
             <w:pPr>
+              <w:keepNext/>
               <w:spacing w:after="20" w:line="240" w:lineRule="auto"/>
             </w:pPr>
             <w:r/>
@@ -5263,6 +5451,7 @@
           </w:tcPr>
           <w:p>
             <w:pPr>
+              <w:keepNext/>
               <w:spacing w:after="20" w:line="240" w:lineRule="auto"/>
             </w:pPr>
             <w:r/>
@@ -5281,6 +5470,7 @@
           </w:tcPr>
           <w:p>
             <w:pPr>
+              <w:keepNext/>
               <w:spacing w:after="20" w:line="240" w:lineRule="auto"/>
             </w:pPr>
             <w:r/>
@@ -5863,6 +6053,7 @@
           </w:tcPr>
           <w:p>
             <w:pPr>
+              <w:keepNext/>
               <w:spacing w:after="20" w:line="240" w:lineRule="auto"/>
             </w:pPr>
             <w:r>
@@ -5888,6 +6079,7 @@
           </w:tcPr>
           <w:p>
             <w:pPr>
+              <w:keepNext/>
               <w:spacing w:after="20" w:line="240" w:lineRule="auto"/>
             </w:pPr>
             <w:r>
@@ -5913,6 +6105,7 @@
           </w:tcPr>
           <w:p>
             <w:pPr>
+              <w:keepNext/>
               <w:spacing w:after="20" w:line="240" w:lineRule="auto"/>
             </w:pPr>
             <w:r>
@@ -5942,6 +6135,7 @@
           </w:tcPr>
           <w:p>
             <w:pPr>
+              <w:keepNext/>
               <w:spacing w:after="20" w:line="240" w:lineRule="auto"/>
             </w:pPr>
             <w:r/>
@@ -5959,6 +6153,7 @@
           </w:tcPr>
           <w:p>
             <w:pPr>
+              <w:keepNext/>
               <w:spacing w:after="20" w:line="240" w:lineRule="auto"/>
             </w:pPr>
             <w:r/>
@@ -5976,6 +6171,7 @@
           </w:tcPr>
           <w:p>
             <w:pPr>
+              <w:keepNext/>
               <w:spacing w:after="20" w:line="240" w:lineRule="auto"/>
             </w:pPr>
             <w:r/>
@@ -5999,6 +6195,7 @@
           </w:tcPr>
           <w:p>
             <w:pPr>
+              <w:keepNext/>
               <w:spacing w:after="20" w:line="240" w:lineRule="auto"/>
             </w:pPr>
             <w:r/>
@@ -6017,6 +6214,7 @@
           </w:tcPr>
           <w:p>
             <w:pPr>
+              <w:keepNext/>
               <w:spacing w:after="20" w:line="240" w:lineRule="auto"/>
             </w:pPr>
             <w:r/>
@@ -6035,6 +6233,7 @@
           </w:tcPr>
           <w:p>
             <w:pPr>
+              <w:keepNext/>
               <w:spacing w:after="20" w:line="240" w:lineRule="auto"/>
             </w:pPr>
             <w:r/>
@@ -6650,6 +6849,7 @@
           </w:tcPr>
           <w:p>
             <w:pPr>
+              <w:keepNext/>
               <w:spacing w:after="20" w:line="240" w:lineRule="auto"/>
             </w:pPr>
             <w:r>
@@ -6675,6 +6875,7 @@
           </w:tcPr>
           <w:p>
             <w:pPr>
+              <w:keepNext/>
               <w:spacing w:after="20" w:line="240" w:lineRule="auto"/>
             </w:pPr>
             <w:r>
@@ -6700,6 +6901,7 @@
           </w:tcPr>
           <w:p>
             <w:pPr>
+              <w:keepNext/>
               <w:spacing w:after="20" w:line="240" w:lineRule="auto"/>
             </w:pPr>
             <w:r>
@@ -6725,6 +6927,7 @@
           </w:tcPr>
           <w:p>
             <w:pPr>
+              <w:keepNext/>
               <w:spacing w:after="20" w:line="240" w:lineRule="auto"/>
             </w:pPr>
             <w:r>
@@ -6750,6 +6953,7 @@
           </w:tcPr>
           <w:p>
             <w:pPr>
+              <w:keepNext/>
               <w:spacing w:after="20" w:line="240" w:lineRule="auto"/>
             </w:pPr>
             <w:r>
@@ -6779,6 +6983,7 @@
           </w:tcPr>
           <w:p>
             <w:pPr>
+              <w:keepNext/>
               <w:spacing w:after="20" w:line="240" w:lineRule="auto"/>
             </w:pPr>
             <w:r/>
@@ -6796,6 +7001,7 @@
           </w:tcPr>
           <w:p>
             <w:pPr>
+              <w:keepNext/>
               <w:spacing w:after="20" w:line="240" w:lineRule="auto"/>
             </w:pPr>
             <w:r/>
@@ -6813,6 +7019,7 @@
           </w:tcPr>
           <w:p>
             <w:pPr>
+              <w:keepNext/>
               <w:spacing w:after="20" w:line="240" w:lineRule="auto"/>
             </w:pPr>
             <w:r/>
@@ -6830,6 +7037,7 @@
           </w:tcPr>
           <w:p>
             <w:pPr>
+              <w:keepNext/>
               <w:spacing w:after="20" w:line="240" w:lineRule="auto"/>
             </w:pPr>
             <w:r/>
@@ -6847,6 +7055,7 @@
           </w:tcPr>
           <w:p>
             <w:pPr>
+              <w:keepNext/>
               <w:spacing w:after="20" w:line="240" w:lineRule="auto"/>
             </w:pPr>
             <w:r/>
@@ -6870,6 +7079,7 @@
           </w:tcPr>
           <w:p>
             <w:pPr>
+              <w:keepNext/>
               <w:spacing w:after="20" w:line="240" w:lineRule="auto"/>
             </w:pPr>
             <w:r/>
@@ -6888,6 +7098,7 @@
           </w:tcPr>
           <w:p>
             <w:pPr>
+              <w:keepNext/>
               <w:spacing w:after="20" w:line="240" w:lineRule="auto"/>
             </w:pPr>
             <w:r/>
@@ -6906,6 +7117,7 @@
           </w:tcPr>
           <w:p>
             <w:pPr>
+              <w:keepNext/>
               <w:spacing w:after="20" w:line="240" w:lineRule="auto"/>
             </w:pPr>
             <w:r/>
@@ -6924,6 +7136,7 @@
           </w:tcPr>
           <w:p>
             <w:pPr>
+              <w:keepNext/>
               <w:spacing w:after="20" w:line="240" w:lineRule="auto"/>
             </w:pPr>
             <w:r/>
@@ -6942,6 +7155,7 @@
           </w:tcPr>
           <w:p>
             <w:pPr>
+              <w:keepNext/>
               <w:spacing w:after="20" w:line="240" w:lineRule="auto"/>
             </w:pPr>
             <w:r/>
@@ -7223,6 +7437,7 @@
           </w:tcPr>
           <w:p>
             <w:pPr>
+              <w:keepNext/>
               <w:spacing w:after="20" w:line="240" w:lineRule="auto"/>
             </w:pPr>
             <w:r>
@@ -7248,6 +7463,7 @@
           </w:tcPr>
           <w:p>
             <w:pPr>
+              <w:keepNext/>
               <w:spacing w:after="20" w:line="240" w:lineRule="auto"/>
             </w:pPr>
             <w:r>
@@ -7273,6 +7489,7 @@
           </w:tcPr>
           <w:p>
             <w:pPr>
+              <w:keepNext/>
               <w:spacing w:after="20" w:line="240" w:lineRule="auto"/>
             </w:pPr>
             <w:r>
@@ -7298,6 +7515,7 @@
           </w:tcPr>
           <w:p>
             <w:pPr>
+              <w:keepNext/>
               <w:spacing w:after="20" w:line="240" w:lineRule="auto"/>
             </w:pPr>
             <w:r>
@@ -7323,6 +7541,7 @@
           </w:tcPr>
           <w:p>
             <w:pPr>
+              <w:keepNext/>
               <w:spacing w:after="20" w:line="240" w:lineRule="auto"/>
             </w:pPr>
             <w:r>
@@ -7352,6 +7571,7 @@
           </w:tcPr>
           <w:p>
             <w:pPr>
+              <w:keepNext/>
               <w:spacing w:after="20" w:line="240" w:lineRule="auto"/>
             </w:pPr>
             <w:r/>
@@ -7369,6 +7589,7 @@
           </w:tcPr>
           <w:p>
             <w:pPr>
+              <w:keepNext/>
               <w:spacing w:after="20" w:line="240" w:lineRule="auto"/>
             </w:pPr>
             <w:r/>
@@ -7386,6 +7607,7 @@
           </w:tcPr>
           <w:p>
             <w:pPr>
+              <w:keepNext/>
               <w:spacing w:after="20" w:line="240" w:lineRule="auto"/>
             </w:pPr>
             <w:r/>
@@ -7403,6 +7625,7 @@
           </w:tcPr>
           <w:p>
             <w:pPr>
+              <w:keepNext/>
               <w:spacing w:after="20" w:line="240" w:lineRule="auto"/>
             </w:pPr>
             <w:r/>
@@ -7420,6 +7643,7 @@
           </w:tcPr>
           <w:p>
             <w:pPr>
+              <w:keepNext/>
               <w:spacing w:after="20" w:line="240" w:lineRule="auto"/>
             </w:pPr>
             <w:r/>
@@ -7443,6 +7667,7 @@
           </w:tcPr>
           <w:p>
             <w:pPr>
+              <w:keepNext/>
               <w:spacing w:after="20" w:line="240" w:lineRule="auto"/>
             </w:pPr>
             <w:r/>
@@ -7461,6 +7686,7 @@
           </w:tcPr>
           <w:p>
             <w:pPr>
+              <w:keepNext/>
               <w:spacing w:after="20" w:line="240" w:lineRule="auto"/>
             </w:pPr>
             <w:r/>
@@ -7479,6 +7705,7 @@
           </w:tcPr>
           <w:p>
             <w:pPr>
+              <w:keepNext/>
               <w:spacing w:after="20" w:line="240" w:lineRule="auto"/>
             </w:pPr>
             <w:r/>
@@ -7497,6 +7724,7 @@
           </w:tcPr>
           <w:p>
             <w:pPr>
+              <w:keepNext/>
               <w:spacing w:after="20" w:line="240" w:lineRule="auto"/>
             </w:pPr>
             <w:r/>
@@ -7515,6 +7743,7 @@
           </w:tcPr>
           <w:p>
             <w:pPr>
+              <w:keepNext/>
               <w:spacing w:after="20" w:line="240" w:lineRule="auto"/>
             </w:pPr>
             <w:r/>
@@ -7537,6 +7766,7 @@
           </w:tcPr>
           <w:p>
             <w:pPr>
+              <w:keepNext/>
               <w:spacing w:after="20" w:line="240" w:lineRule="auto"/>
             </w:pPr>
             <w:r/>
@@ -7554,6 +7784,7 @@
           </w:tcPr>
           <w:p>
             <w:pPr>
+              <w:keepNext/>
               <w:spacing w:after="20" w:line="240" w:lineRule="auto"/>
             </w:pPr>
             <w:r/>
@@ -7571,6 +7802,7 @@
           </w:tcPr>
           <w:p>
             <w:pPr>
+              <w:keepNext/>
               <w:spacing w:after="20" w:line="240" w:lineRule="auto"/>
             </w:pPr>
             <w:r/>
@@ -7588,6 +7820,7 @@
           </w:tcPr>
           <w:p>
             <w:pPr>
+              <w:keepNext/>
               <w:spacing w:after="20" w:line="240" w:lineRule="auto"/>
             </w:pPr>
             <w:r/>
@@ -7605,6 +7838,7 @@
           </w:tcPr>
           <w:p>
             <w:pPr>
+              <w:keepNext/>
               <w:spacing w:after="20" w:line="240" w:lineRule="auto"/>
             </w:pPr>
             <w:r/>
@@ -7628,6 +7862,7 @@
           </w:tcPr>
           <w:p>
             <w:pPr>
+              <w:keepNext/>
               <w:spacing w:after="20" w:line="240" w:lineRule="auto"/>
             </w:pPr>
             <w:r/>
@@ -7646,6 +7881,7 @@
           </w:tcPr>
           <w:p>
             <w:pPr>
+              <w:keepNext/>
               <w:spacing w:after="20" w:line="240" w:lineRule="auto"/>
             </w:pPr>
             <w:r/>
@@ -7664,6 +7900,7 @@
           </w:tcPr>
           <w:p>
             <w:pPr>
+              <w:keepNext/>
               <w:spacing w:after="20" w:line="240" w:lineRule="auto"/>
             </w:pPr>
             <w:r/>
@@ -7682,6 +7919,7 @@
           </w:tcPr>
           <w:p>
             <w:pPr>
+              <w:keepNext/>
               <w:spacing w:after="20" w:line="240" w:lineRule="auto"/>
             </w:pPr>
             <w:r/>
@@ -7700,6 +7938,7 @@
           </w:tcPr>
           <w:p>
             <w:pPr>
+              <w:keepNext/>
               <w:spacing w:after="20" w:line="240" w:lineRule="auto"/>
             </w:pPr>
             <w:r/>
@@ -7722,6 +7961,7 @@
           </w:tcPr>
           <w:p>
             <w:pPr>
+              <w:keepNext/>
               <w:spacing w:after="20" w:line="240" w:lineRule="auto"/>
             </w:pPr>
             <w:r/>
@@ -7739,6 +7979,7 @@
           </w:tcPr>
           <w:p>
             <w:pPr>
+              <w:keepNext/>
               <w:spacing w:after="20" w:line="240" w:lineRule="auto"/>
             </w:pPr>
             <w:r/>
@@ -7756,6 +7997,7 @@
           </w:tcPr>
           <w:p>
             <w:pPr>
+              <w:keepNext/>
               <w:spacing w:after="20" w:line="240" w:lineRule="auto"/>
             </w:pPr>
             <w:r/>
@@ -7773,6 +8015,7 @@
           </w:tcPr>
           <w:p>
             <w:pPr>
+              <w:keepNext/>
               <w:spacing w:after="20" w:line="240" w:lineRule="auto"/>
             </w:pPr>
             <w:r/>
@@ -7790,6 +8033,7 @@
           </w:tcPr>
           <w:p>
             <w:pPr>
+              <w:keepNext/>
               <w:spacing w:after="20" w:line="240" w:lineRule="auto"/>
             </w:pPr>
             <w:r/>
@@ -7813,6 +8057,7 @@
           </w:tcPr>
           <w:p>
             <w:pPr>
+              <w:keepNext/>
               <w:spacing w:after="20" w:line="240" w:lineRule="auto"/>
             </w:pPr>
             <w:r/>
@@ -7831,6 +8076,7 @@
           </w:tcPr>
           <w:p>
             <w:pPr>
+              <w:keepNext/>
               <w:spacing w:after="20" w:line="240" w:lineRule="auto"/>
             </w:pPr>
             <w:r/>
@@ -7849,6 +8095,7 @@
           </w:tcPr>
           <w:p>
             <w:pPr>
+              <w:keepNext/>
               <w:spacing w:after="20" w:line="240" w:lineRule="auto"/>
             </w:pPr>
             <w:r/>
@@ -7867,6 +8114,7 @@
           </w:tcPr>
           <w:p>
             <w:pPr>
+              <w:keepNext/>
               <w:spacing w:after="20" w:line="240" w:lineRule="auto"/>
             </w:pPr>
             <w:r/>
@@ -7885,6 +8133,7 @@
           </w:tcPr>
           <w:p>
             <w:pPr>
+              <w:keepNext/>
               <w:spacing w:after="20" w:line="240" w:lineRule="auto"/>
             </w:pPr>
             <w:r/>
@@ -8815,6 +9064,7 @@
           </w:tcPr>
           <w:p>
             <w:pPr>
+              <w:keepNext/>
               <w:spacing w:after="20" w:line="240" w:lineRule="auto"/>
             </w:pPr>
             <w:r>
@@ -8840,6 +9090,7 @@
           </w:tcPr>
           <w:p>
             <w:pPr>
+              <w:keepNext/>
               <w:spacing w:after="20" w:line="240" w:lineRule="auto"/>
             </w:pPr>
             <w:r>
@@ -8869,6 +9120,7 @@
           </w:tcPr>
           <w:p>
             <w:pPr>
+              <w:keepNext/>
               <w:spacing w:after="20" w:line="240" w:lineRule="auto"/>
             </w:pPr>
             <w:r/>
@@ -8886,6 +9138,7 @@
           </w:tcPr>
           <w:p>
             <w:pPr>
+              <w:keepNext/>
               <w:spacing w:after="20" w:line="240" w:lineRule="auto"/>
             </w:pPr>
             <w:r/>
@@ -8909,6 +9162,7 @@
           </w:tcPr>
           <w:p>
             <w:pPr>
+              <w:keepNext/>
               <w:spacing w:after="20" w:line="240" w:lineRule="auto"/>
             </w:pPr>
             <w:r/>
@@ -8927,6 +9181,7 @@
           </w:tcPr>
           <w:p>
             <w:pPr>
+              <w:keepNext/>
               <w:spacing w:after="20" w:line="240" w:lineRule="auto"/>
             </w:pPr>
             <w:r/>
@@ -8949,6 +9204,7 @@
           </w:tcPr>
           <w:p>
             <w:pPr>
+              <w:keepNext/>
               <w:spacing w:after="20" w:line="240" w:lineRule="auto"/>
             </w:pPr>
             <w:r/>
@@ -8966,6 +9222,7 @@
           </w:tcPr>
           <w:p>
             <w:pPr>
+              <w:keepNext/>
               <w:spacing w:after="20" w:line="240" w:lineRule="auto"/>
             </w:pPr>
             <w:r/>
@@ -8989,6 +9246,7 @@
           </w:tcPr>
           <w:p>
             <w:pPr>
+              <w:keepNext/>
               <w:spacing w:after="20" w:line="240" w:lineRule="auto"/>
             </w:pPr>
             <w:r/>
@@ -9007,6 +9265,7 @@
           </w:tcPr>
           <w:p>
             <w:pPr>
+              <w:keepNext/>
               <w:spacing w:after="20" w:line="240" w:lineRule="auto"/>
             </w:pPr>
             <w:r/>
@@ -9029,6 +9288,7 @@
           </w:tcPr>
           <w:p>
             <w:pPr>
+              <w:keepNext/>
               <w:spacing w:after="20" w:line="240" w:lineRule="auto"/>
             </w:pPr>
             <w:r/>
@@ -9046,6 +9306,7 @@
           </w:tcPr>
           <w:p>
             <w:pPr>
+              <w:keepNext/>
               <w:spacing w:after="20" w:line="240" w:lineRule="auto"/>
             </w:pPr>
             <w:r/>
@@ -9136,6 +9397,7 @@
           </w:tcPr>
           <w:p>
             <w:pPr>
+              <w:keepNext/>
               <w:spacing w:after="20" w:line="240" w:lineRule="auto"/>
             </w:pPr>
             <w:r>
@@ -9161,6 +9423,7 @@
           </w:tcPr>
           <w:p>
             <w:pPr>
+              <w:keepNext/>
               <w:spacing w:after="20" w:line="240" w:lineRule="auto"/>
             </w:pPr>
             <w:r>
@@ -9190,6 +9453,7 @@
           </w:tcPr>
           <w:p>
             <w:pPr>
+              <w:keepNext/>
               <w:spacing w:after="20" w:line="240" w:lineRule="auto"/>
             </w:pPr>
             <w:r/>
@@ -9207,6 +9471,7 @@
           </w:tcPr>
           <w:p>
             <w:pPr>
+              <w:keepNext/>
               <w:spacing w:after="20" w:line="240" w:lineRule="auto"/>
             </w:pPr>
             <w:r/>
@@ -9230,6 +9495,7 @@
           </w:tcPr>
           <w:p>
             <w:pPr>
+              <w:keepNext/>
               <w:spacing w:after="20" w:line="240" w:lineRule="auto"/>
             </w:pPr>
             <w:r/>
@@ -9248,6 +9514,7 @@
           </w:tcPr>
           <w:p>
             <w:pPr>
+              <w:keepNext/>
               <w:spacing w:after="20" w:line="240" w:lineRule="auto"/>
             </w:pPr>
             <w:r/>
@@ -9270,6 +9537,7 @@
           </w:tcPr>
           <w:p>
             <w:pPr>
+              <w:keepNext/>
               <w:spacing w:after="20" w:line="240" w:lineRule="auto"/>
             </w:pPr>
             <w:r/>
@@ -9287,6 +9555,7 @@
           </w:tcPr>
           <w:p>
             <w:pPr>
+              <w:keepNext/>
               <w:spacing w:after="20" w:line="240" w:lineRule="auto"/>
             </w:pPr>
             <w:r/>
@@ -9310,6 +9579,7 @@
           </w:tcPr>
           <w:p>
             <w:pPr>
+              <w:keepNext/>
               <w:spacing w:after="20" w:line="240" w:lineRule="auto"/>
             </w:pPr>
             <w:r/>
@@ -9328,6 +9598,7 @@
           </w:tcPr>
           <w:p>
             <w:pPr>
+              <w:keepNext/>
               <w:spacing w:after="20" w:line="240" w:lineRule="auto"/>
             </w:pPr>
             <w:r/>
@@ -9350,6 +9621,7 @@
           </w:tcPr>
           <w:p>
             <w:pPr>
+              <w:keepNext/>
               <w:spacing w:after="20" w:line="240" w:lineRule="auto"/>
             </w:pPr>
             <w:r/>
@@ -9367,6 +9639,7 @@
           </w:tcPr>
           <w:p>
             <w:pPr>
+              <w:keepNext/>
               <w:spacing w:after="20" w:line="240" w:lineRule="auto"/>
             </w:pPr>
             <w:r/>
@@ -9390,6 +9663,7 @@
           </w:tcPr>
           <w:p>
             <w:pPr>
+              <w:keepNext/>
               <w:spacing w:after="20" w:line="240" w:lineRule="auto"/>
             </w:pPr>
             <w:r/>
@@ -9408,6 +9682,7 @@
           </w:tcPr>
           <w:p>
             <w:pPr>
+              <w:keepNext/>
               <w:spacing w:after="20" w:line="240" w:lineRule="auto"/>
             </w:pPr>
             <w:r/>
@@ -9430,6 +9705,7 @@
           </w:tcPr>
           <w:p>
             <w:pPr>
+              <w:keepNext/>
               <w:spacing w:after="20" w:line="240" w:lineRule="auto"/>
             </w:pPr>
             <w:r/>
@@ -9447,6 +9723,7 @@
           </w:tcPr>
           <w:p>
             <w:pPr>
+              <w:keepNext/>
               <w:spacing w:after="20" w:line="240" w:lineRule="auto"/>
             </w:pPr>
             <w:r/>
@@ -9565,6 +9842,7 @@
           </w:tcPr>
           <w:p>
             <w:pPr>
+              <w:keepNext/>
               <w:spacing w:after="20" w:line="240" w:lineRule="auto"/>
             </w:pPr>
             <w:r>
@@ -9590,6 +9868,7 @@
           </w:tcPr>
           <w:p>
             <w:pPr>
+              <w:keepNext/>
               <w:spacing w:after="20" w:line="240" w:lineRule="auto"/>
             </w:pPr>
             <w:r>
@@ -9615,6 +9894,7 @@
           </w:tcPr>
           <w:p>
             <w:pPr>
+              <w:keepNext/>
               <w:spacing w:after="20" w:line="240" w:lineRule="auto"/>
             </w:pPr>
             <w:r>
@@ -9640,6 +9920,7 @@
           </w:tcPr>
           <w:p>
             <w:pPr>
+              <w:keepNext/>
               <w:spacing w:after="20" w:line="240" w:lineRule="auto"/>
             </w:pPr>
             <w:r>
@@ -9665,6 +9946,7 @@
           </w:tcPr>
           <w:p>
             <w:pPr>
+              <w:keepNext/>
               <w:spacing w:after="20" w:line="240" w:lineRule="auto"/>
             </w:pPr>
             <w:r>
@@ -9690,6 +9972,7 @@
           </w:tcPr>
           <w:p>
             <w:pPr>
+              <w:keepNext/>
               <w:spacing w:after="20" w:line="240" w:lineRule="auto"/>
             </w:pPr>
             <w:r>
@@ -9715,6 +9998,7 @@
           </w:tcPr>
           <w:p>
             <w:pPr>
+              <w:keepNext/>
               <w:spacing w:after="20" w:line="240" w:lineRule="auto"/>
             </w:pPr>
             <w:r>
@@ -9744,6 +10028,7 @@
           </w:tcPr>
           <w:p>
             <w:pPr>
+              <w:keepNext/>
               <w:spacing w:after="20" w:line="240" w:lineRule="auto"/>
             </w:pPr>
             <w:r/>
@@ -9761,6 +10046,7 @@
           </w:tcPr>
           <w:p>
             <w:pPr>
+              <w:keepNext/>
               <w:spacing w:after="20" w:line="240" w:lineRule="auto"/>
             </w:pPr>
             <w:r/>
@@ -9778,6 +10064,7 @@
           </w:tcPr>
           <w:p>
             <w:pPr>
+              <w:keepNext/>
               <w:spacing w:after="20" w:line="240" w:lineRule="auto"/>
             </w:pPr>
             <w:r/>
@@ -9795,6 +10082,7 @@
           </w:tcPr>
           <w:p>
             <w:pPr>
+              <w:keepNext/>
               <w:spacing w:after="20" w:line="240" w:lineRule="auto"/>
             </w:pPr>
             <w:r/>
@@ -9812,6 +10100,7 @@
           </w:tcPr>
           <w:p>
             <w:pPr>
+              <w:keepNext/>
               <w:spacing w:after="20" w:line="240" w:lineRule="auto"/>
             </w:pPr>
             <w:r/>
@@ -9829,6 +10118,7 @@
           </w:tcPr>
           <w:p>
             <w:pPr>
+              <w:keepNext/>
               <w:spacing w:after="20" w:line="240" w:lineRule="auto"/>
             </w:pPr>
             <w:r/>
@@ -9846,6 +10136,7 @@
           </w:tcPr>
           <w:p>
             <w:pPr>
+              <w:keepNext/>
               <w:spacing w:after="20" w:line="240" w:lineRule="auto"/>
             </w:pPr>
             <w:r/>
@@ -9869,6 +10160,7 @@
           </w:tcPr>
           <w:p>
             <w:pPr>
+              <w:keepNext/>
               <w:spacing w:after="20" w:line="240" w:lineRule="auto"/>
             </w:pPr>
             <w:r/>
@@ -9887,6 +10179,7 @@
           </w:tcPr>
           <w:p>
             <w:pPr>
+              <w:keepNext/>
               <w:spacing w:after="20" w:line="240" w:lineRule="auto"/>
             </w:pPr>
             <w:r/>
@@ -9905,6 +10198,7 @@
           </w:tcPr>
           <w:p>
             <w:pPr>
+              <w:keepNext/>
               <w:spacing w:after="20" w:line="240" w:lineRule="auto"/>
             </w:pPr>
             <w:r/>
@@ -9923,6 +10217,7 @@
           </w:tcPr>
           <w:p>
             <w:pPr>
+              <w:keepNext/>
               <w:spacing w:after="20" w:line="240" w:lineRule="auto"/>
             </w:pPr>
             <w:r/>
@@ -9941,6 +10236,7 @@
           </w:tcPr>
           <w:p>
             <w:pPr>
+              <w:keepNext/>
               <w:spacing w:after="20" w:line="240" w:lineRule="auto"/>
             </w:pPr>
             <w:r/>
@@ -9959,6 +10255,7 @@
           </w:tcPr>
           <w:p>
             <w:pPr>
+              <w:keepNext/>
               <w:spacing w:after="20" w:line="240" w:lineRule="auto"/>
             </w:pPr>
             <w:r/>
@@ -9977,6 +10274,7 @@
           </w:tcPr>
           <w:p>
             <w:pPr>
+              <w:keepNext/>
               <w:spacing w:after="20" w:line="240" w:lineRule="auto"/>
             </w:pPr>
             <w:r/>
@@ -9999,6 +10297,7 @@
           </w:tcPr>
           <w:p>
             <w:pPr>
+              <w:keepNext/>
               <w:spacing w:after="20" w:line="240" w:lineRule="auto"/>
             </w:pPr>
             <w:r/>
@@ -10016,6 +10315,7 @@
           </w:tcPr>
           <w:p>
             <w:pPr>
+              <w:keepNext/>
               <w:spacing w:after="20" w:line="240" w:lineRule="auto"/>
             </w:pPr>
             <w:r/>
@@ -10033,6 +10333,7 @@
           </w:tcPr>
           <w:p>
             <w:pPr>
+              <w:keepNext/>
               <w:spacing w:after="20" w:line="240" w:lineRule="auto"/>
             </w:pPr>
             <w:r/>
@@ -10050,6 +10351,7 @@
           </w:tcPr>
           <w:p>
             <w:pPr>
+              <w:keepNext/>
               <w:spacing w:after="20" w:line="240" w:lineRule="auto"/>
             </w:pPr>
             <w:r/>
@@ -10067,6 +10369,7 @@
           </w:tcPr>
           <w:p>
             <w:pPr>
+              <w:keepNext/>
               <w:spacing w:after="20" w:line="240" w:lineRule="auto"/>
             </w:pPr>
             <w:r/>
@@ -10084,6 +10387,7 @@
           </w:tcPr>
           <w:p>
             <w:pPr>
+              <w:keepNext/>
               <w:spacing w:after="20" w:line="240" w:lineRule="auto"/>
             </w:pPr>
             <w:r/>
@@ -10101,6 +10405,7 @@
           </w:tcPr>
           <w:p>
             <w:pPr>
+              <w:keepNext/>
               <w:spacing w:after="20" w:line="240" w:lineRule="auto"/>
             </w:pPr>
             <w:r/>
@@ -10124,6 +10429,7 @@
           </w:tcPr>
           <w:p>
             <w:pPr>
+              <w:keepNext/>
               <w:spacing w:after="20" w:line="240" w:lineRule="auto"/>
             </w:pPr>
             <w:r/>
@@ -10142,6 +10448,7 @@
           </w:tcPr>
           <w:p>
             <w:pPr>
+              <w:keepNext/>
               <w:spacing w:after="20" w:line="240" w:lineRule="auto"/>
             </w:pPr>
             <w:r/>
@@ -10160,6 +10467,7 @@
           </w:tcPr>
           <w:p>
             <w:pPr>
+              <w:keepNext/>
               <w:spacing w:after="20" w:line="240" w:lineRule="auto"/>
             </w:pPr>
             <w:r/>
@@ -10178,6 +10486,7 @@
           </w:tcPr>
           <w:p>
             <w:pPr>
+              <w:keepNext/>
               <w:spacing w:after="20" w:line="240" w:lineRule="auto"/>
             </w:pPr>
             <w:r/>
@@ -10196,6 +10505,7 @@
           </w:tcPr>
           <w:p>
             <w:pPr>
+              <w:keepNext/>
               <w:spacing w:after="20" w:line="240" w:lineRule="auto"/>
             </w:pPr>
             <w:r/>
@@ -10214,6 +10524,7 @@
           </w:tcPr>
           <w:p>
             <w:pPr>
+              <w:keepNext/>
               <w:spacing w:after="20" w:line="240" w:lineRule="auto"/>
             </w:pPr>
             <w:r/>
@@ -10232,6 +10543,7 @@
           </w:tcPr>
           <w:p>
             <w:pPr>
+              <w:keepNext/>
               <w:spacing w:after="20" w:line="240" w:lineRule="auto"/>
             </w:pPr>
             <w:r/>
@@ -10254,6 +10566,7 @@
           </w:tcPr>
           <w:p>
             <w:pPr>
+              <w:keepNext/>
               <w:spacing w:after="20" w:line="240" w:lineRule="auto"/>
             </w:pPr>
             <w:r/>
@@ -10271,6 +10584,7 @@
           </w:tcPr>
           <w:p>
             <w:pPr>
+              <w:keepNext/>
               <w:spacing w:after="20" w:line="240" w:lineRule="auto"/>
             </w:pPr>
             <w:r/>
@@ -10288,6 +10602,7 @@
           </w:tcPr>
           <w:p>
             <w:pPr>
+              <w:keepNext/>
               <w:spacing w:after="20" w:line="240" w:lineRule="auto"/>
             </w:pPr>
             <w:r/>
@@ -10305,6 +10620,7 @@
           </w:tcPr>
           <w:p>
             <w:pPr>
+              <w:keepNext/>
               <w:spacing w:after="20" w:line="240" w:lineRule="auto"/>
             </w:pPr>
             <w:r/>
@@ -10322,6 +10638,7 @@
           </w:tcPr>
           <w:p>
             <w:pPr>
+              <w:keepNext/>
               <w:spacing w:after="20" w:line="240" w:lineRule="auto"/>
             </w:pPr>
             <w:r/>
@@ -10339,6 +10656,7 @@
           </w:tcPr>
           <w:p>
             <w:pPr>
+              <w:keepNext/>
               <w:spacing w:after="20" w:line="240" w:lineRule="auto"/>
             </w:pPr>
             <w:r/>
@@ -10356,6 +10674,7 @@
           </w:tcPr>
           <w:p>
             <w:pPr>
+              <w:keepNext/>
               <w:spacing w:after="20" w:line="240" w:lineRule="auto"/>
             </w:pPr>
             <w:r/>
@@ -10379,6 +10698,7 @@
           </w:tcPr>
           <w:p>
             <w:pPr>
+              <w:keepNext/>
               <w:spacing w:after="20" w:line="240" w:lineRule="auto"/>
             </w:pPr>
             <w:r/>
@@ -10397,6 +10717,7 @@
           </w:tcPr>
           <w:p>
             <w:pPr>
+              <w:keepNext/>
               <w:spacing w:after="20" w:line="240" w:lineRule="auto"/>
             </w:pPr>
             <w:r/>
@@ -10415,6 +10736,7 @@
           </w:tcPr>
           <w:p>
             <w:pPr>
+              <w:keepNext/>
               <w:spacing w:after="20" w:line="240" w:lineRule="auto"/>
             </w:pPr>
             <w:r/>
@@ -10433,6 +10755,7 @@
           </w:tcPr>
           <w:p>
             <w:pPr>
+              <w:keepNext/>
               <w:spacing w:after="20" w:line="240" w:lineRule="auto"/>
             </w:pPr>
             <w:r/>
@@ -10451,6 +10774,7 @@
           </w:tcPr>
           <w:p>
             <w:pPr>
+              <w:keepNext/>
               <w:spacing w:after="20" w:line="240" w:lineRule="auto"/>
             </w:pPr>
             <w:r/>
@@ -10469,6 +10793,7 @@
           </w:tcPr>
           <w:p>
             <w:pPr>
+              <w:keepNext/>
               <w:spacing w:after="20" w:line="240" w:lineRule="auto"/>
             </w:pPr>
             <w:r/>
@@ -10487,6 +10812,7 @@
           </w:tcPr>
           <w:p>
             <w:pPr>
+              <w:keepNext/>
               <w:spacing w:after="20" w:line="240" w:lineRule="auto"/>
             </w:pPr>
             <w:r/>
@@ -10509,6 +10835,7 @@
           </w:tcPr>
           <w:p>
             <w:pPr>
+              <w:keepNext/>
               <w:spacing w:after="20" w:line="240" w:lineRule="auto"/>
             </w:pPr>
             <w:r/>
@@ -10526,6 +10853,7 @@
           </w:tcPr>
           <w:p>
             <w:pPr>
+              <w:keepNext/>
               <w:spacing w:after="20" w:line="240" w:lineRule="auto"/>
             </w:pPr>
             <w:r/>
@@ -10543,6 +10871,7 @@
           </w:tcPr>
           <w:p>
             <w:pPr>
+              <w:keepNext/>
               <w:spacing w:after="20" w:line="240" w:lineRule="auto"/>
             </w:pPr>
             <w:r/>
@@ -10560,6 +10889,7 @@
           </w:tcPr>
           <w:p>
             <w:pPr>
+              <w:keepNext/>
               <w:spacing w:after="20" w:line="240" w:lineRule="auto"/>
             </w:pPr>
             <w:r/>
@@ -10577,6 +10907,7 @@
           </w:tcPr>
           <w:p>
             <w:pPr>
+              <w:keepNext/>
               <w:spacing w:after="20" w:line="240" w:lineRule="auto"/>
             </w:pPr>
             <w:r/>
@@ -10594,6 +10925,7 @@
           </w:tcPr>
           <w:p>
             <w:pPr>
+              <w:keepNext/>
               <w:spacing w:after="20" w:line="240" w:lineRule="auto"/>
             </w:pPr>
             <w:r/>
@@ -10611,6 +10943,7 @@
           </w:tcPr>
           <w:p>
             <w:pPr>
+              <w:keepNext/>
               <w:spacing w:after="20" w:line="240" w:lineRule="auto"/>
             </w:pPr>
             <w:r/>
@@ -10634,6 +10967,7 @@
           </w:tcPr>
           <w:p>
             <w:pPr>
+              <w:keepNext/>
               <w:spacing w:after="20" w:line="240" w:lineRule="auto"/>
             </w:pPr>
             <w:r/>
@@ -10652,6 +10986,7 @@
           </w:tcPr>
           <w:p>
             <w:pPr>
+              <w:keepNext/>
               <w:spacing w:after="20" w:line="240" w:lineRule="auto"/>
             </w:pPr>
             <w:r/>
@@ -10670,6 +11005,7 @@
           </w:tcPr>
           <w:p>
             <w:pPr>
+              <w:keepNext/>
               <w:spacing w:after="20" w:line="240" w:lineRule="auto"/>
             </w:pPr>
             <w:r/>
@@ -10688,6 +11024,7 @@
           </w:tcPr>
           <w:p>
             <w:pPr>
+              <w:keepNext/>
               <w:spacing w:after="20" w:line="240" w:lineRule="auto"/>
             </w:pPr>
             <w:r/>
@@ -10706,6 +11043,7 @@
           </w:tcPr>
           <w:p>
             <w:pPr>
+              <w:keepNext/>
               <w:spacing w:after="20" w:line="240" w:lineRule="auto"/>
             </w:pPr>
             <w:r/>
@@ -10724,6 +11062,7 @@
           </w:tcPr>
           <w:p>
             <w:pPr>
+              <w:keepNext/>
               <w:spacing w:after="20" w:line="240" w:lineRule="auto"/>
             </w:pPr>
             <w:r/>
@@ -10742,6 +11081,7 @@
           </w:tcPr>
           <w:p>
             <w:pPr>
+              <w:keepNext/>
               <w:spacing w:after="20" w:line="240" w:lineRule="auto"/>
             </w:pPr>
             <w:r/>
@@ -10764,6 +11104,7 @@
           </w:tcPr>
           <w:p>
             <w:pPr>
+              <w:keepNext/>
               <w:spacing w:after="20" w:line="240" w:lineRule="auto"/>
             </w:pPr>
             <w:r/>
@@ -10781,6 +11122,7 @@
           </w:tcPr>
           <w:p>
             <w:pPr>
+              <w:keepNext/>
               <w:spacing w:after="20" w:line="240" w:lineRule="auto"/>
             </w:pPr>
             <w:r/>
@@ -10798,6 +11140,7 @@
           </w:tcPr>
           <w:p>
             <w:pPr>
+              <w:keepNext/>
               <w:spacing w:after="20" w:line="240" w:lineRule="auto"/>
             </w:pPr>
             <w:r/>
@@ -10815,6 +11158,7 @@
           </w:tcPr>
           <w:p>
             <w:pPr>
+              <w:keepNext/>
               <w:spacing w:after="20" w:line="240" w:lineRule="auto"/>
             </w:pPr>
             <w:r/>
@@ -10832,6 +11176,7 @@
           </w:tcPr>
           <w:p>
             <w:pPr>
+              <w:keepNext/>
               <w:spacing w:after="20" w:line="240" w:lineRule="auto"/>
             </w:pPr>
             <w:r/>
@@ -10849,6 +11194,7 @@
           </w:tcPr>
           <w:p>
             <w:pPr>
+              <w:keepNext/>
               <w:spacing w:after="20" w:line="240" w:lineRule="auto"/>
             </w:pPr>
             <w:r/>
@@ -10866,6 +11212,7 @@
           </w:tcPr>
           <w:p>
             <w:pPr>
+              <w:keepNext/>
               <w:spacing w:after="20" w:line="240" w:lineRule="auto"/>
             </w:pPr>
             <w:r/>
@@ -10889,6 +11236,7 @@
           </w:tcPr>
           <w:p>
             <w:pPr>
+              <w:keepNext/>
               <w:spacing w:after="20" w:line="240" w:lineRule="auto"/>
             </w:pPr>
             <w:r/>
@@ -10907,6 +11255,7 @@
           </w:tcPr>
           <w:p>
             <w:pPr>
+              <w:keepNext/>
               <w:spacing w:after="20" w:line="240" w:lineRule="auto"/>
             </w:pPr>
             <w:r/>
@@ -10925,6 +11274,7 @@
           </w:tcPr>
           <w:p>
             <w:pPr>
+              <w:keepNext/>
               <w:spacing w:after="20" w:line="240" w:lineRule="auto"/>
             </w:pPr>
             <w:r/>
@@ -10943,6 +11293,7 @@
           </w:tcPr>
           <w:p>
             <w:pPr>
+              <w:keepNext/>
               <w:spacing w:after="20" w:line="240" w:lineRule="auto"/>
             </w:pPr>
             <w:r/>
@@ -10961,6 +11312,7 @@
           </w:tcPr>
           <w:p>
             <w:pPr>
+              <w:keepNext/>
               <w:spacing w:after="20" w:line="240" w:lineRule="auto"/>
             </w:pPr>
             <w:r/>
@@ -10979,6 +11331,7 @@
           </w:tcPr>
           <w:p>
             <w:pPr>
+              <w:keepNext/>
               <w:spacing w:after="20" w:line="240" w:lineRule="auto"/>
             </w:pPr>
             <w:r/>
@@ -10997,6 +11350,7 @@
           </w:tcPr>
           <w:p>
             <w:pPr>
+              <w:keepNext/>
               <w:spacing w:after="20" w:line="240" w:lineRule="auto"/>
             </w:pPr>
             <w:r/>
@@ -11019,6 +11373,7 @@
           </w:tcPr>
           <w:p>
             <w:pPr>
+              <w:keepNext/>
               <w:spacing w:after="20" w:line="240" w:lineRule="auto"/>
             </w:pPr>
             <w:r/>
@@ -11036,6 +11391,7 @@
           </w:tcPr>
           <w:p>
             <w:pPr>
+              <w:keepNext/>
               <w:spacing w:after="20" w:line="240" w:lineRule="auto"/>
             </w:pPr>
             <w:r/>
@@ -11053,6 +11409,7 @@
           </w:tcPr>
           <w:p>
             <w:pPr>
+              <w:keepNext/>
               <w:spacing w:after="20" w:line="240" w:lineRule="auto"/>
             </w:pPr>
             <w:r/>
@@ -11070,6 +11427,7 @@
           </w:tcPr>
           <w:p>
             <w:pPr>
+              <w:keepNext/>
               <w:spacing w:after="20" w:line="240" w:lineRule="auto"/>
             </w:pPr>
             <w:r/>
@@ -11087,6 +11445,7 @@
           </w:tcPr>
           <w:p>
             <w:pPr>
+              <w:keepNext/>
               <w:spacing w:after="20" w:line="240" w:lineRule="auto"/>
             </w:pPr>
             <w:r/>
@@ -11104,6 +11463,7 @@
           </w:tcPr>
           <w:p>
             <w:pPr>
+              <w:keepNext/>
               <w:spacing w:after="20" w:line="240" w:lineRule="auto"/>
             </w:pPr>
             <w:r/>
@@ -11121,6 +11481,7 @@
           </w:tcPr>
           <w:p>
             <w:pPr>
+              <w:keepNext/>
               <w:spacing w:after="20" w:line="240" w:lineRule="auto"/>
             </w:pPr>
             <w:r/>
@@ -11580,6 +11941,7 @@
           </w:tcPr>
           <w:p>
             <w:pPr>
+              <w:keepNext/>
               <w:spacing w:after="20" w:line="240" w:lineRule="auto"/>
             </w:pPr>
             <w:r>
@@ -11605,6 +11967,7 @@
           </w:tcPr>
           <w:p>
             <w:pPr>
+              <w:keepNext/>
               <w:spacing w:after="20" w:line="240" w:lineRule="auto"/>
             </w:pPr>
             <w:r>
@@ -11630,6 +11993,7 @@
           </w:tcPr>
           <w:p>
             <w:pPr>
+              <w:keepNext/>
               <w:spacing w:after="20" w:line="240" w:lineRule="auto"/>
             </w:pPr>
             <w:r>
@@ -11655,6 +12019,7 @@
           </w:tcPr>
           <w:p>
             <w:pPr>
+              <w:keepNext/>
               <w:spacing w:after="20" w:line="240" w:lineRule="auto"/>
             </w:pPr>
             <w:r>
@@ -11680,6 +12045,7 @@
           </w:tcPr>
           <w:p>
             <w:pPr>
+              <w:keepNext/>
               <w:spacing w:after="20" w:line="240" w:lineRule="auto"/>
             </w:pPr>
             <w:r>
@@ -11705,6 +12071,7 @@
           </w:tcPr>
           <w:p>
             <w:pPr>
+              <w:keepNext/>
               <w:spacing w:after="20" w:line="240" w:lineRule="auto"/>
             </w:pPr>
             <w:r>
@@ -11730,6 +12097,7 @@
           </w:tcPr>
           <w:p>
             <w:pPr>
+              <w:keepNext/>
               <w:spacing w:after="20" w:line="240" w:lineRule="auto"/>
             </w:pPr>
             <w:r>
@@ -11759,6 +12127,7 @@
           </w:tcPr>
           <w:p>
             <w:pPr>
+              <w:keepNext/>
               <w:spacing w:after="20" w:line="240" w:lineRule="auto"/>
             </w:pPr>
             <w:r/>
@@ -11777,6 +12146,7 @@
           </w:tcPr>
           <w:p>
             <w:pPr>
+              <w:keepNext/>
               <w:spacing w:after="20" w:line="240" w:lineRule="auto"/>
             </w:pPr>
             <w:r/>
@@ -11794,6 +12164,7 @@
           </w:tcPr>
           <w:p>
             <w:pPr>
+              <w:keepNext/>
               <w:spacing w:after="20" w:line="240" w:lineRule="auto"/>
             </w:pPr>
             <w:r/>
@@ -11811,6 +12182,7 @@
           </w:tcPr>
           <w:p>
             <w:pPr>
+              <w:keepNext/>
               <w:spacing w:after="20" w:line="240" w:lineRule="auto"/>
             </w:pPr>
             <w:r/>
@@ -11828,6 +12200,7 @@
           </w:tcPr>
           <w:p>
             <w:pPr>
+              <w:keepNext/>
               <w:spacing w:after="20" w:line="240" w:lineRule="auto"/>
             </w:pPr>
             <w:r/>
@@ -11845,6 +12218,7 @@
           </w:tcPr>
           <w:p>
             <w:pPr>
+              <w:keepNext/>
               <w:spacing w:after="20" w:line="240" w:lineRule="auto"/>
             </w:pPr>
             <w:r/>
@@ -11862,6 +12236,7 @@
           </w:tcPr>
           <w:p>
             <w:pPr>
+              <w:keepNext/>
               <w:spacing w:after="20" w:line="240" w:lineRule="auto"/>
             </w:pPr>
             <w:r/>
@@ -11885,6 +12260,7 @@
           </w:tcPr>
           <w:p>
             <w:pPr>
+              <w:keepNext/>
               <w:spacing w:after="20" w:line="240" w:lineRule="auto"/>
             </w:pPr>
             <w:r/>
@@ -11903,6 +12279,7 @@
           </w:tcPr>
           <w:p>
             <w:pPr>
+              <w:keepNext/>
               <w:spacing w:after="20" w:line="240" w:lineRule="auto"/>
             </w:pPr>
             <w:r/>
@@ -11921,6 +12298,7 @@
           </w:tcPr>
           <w:p>
             <w:pPr>
+              <w:keepNext/>
               <w:spacing w:after="20" w:line="240" w:lineRule="auto"/>
             </w:pPr>
             <w:r/>
@@ -11939,6 +12317,7 @@
           </w:tcPr>
           <w:p>
             <w:pPr>
+              <w:keepNext/>
               <w:spacing w:after="20" w:line="240" w:lineRule="auto"/>
             </w:pPr>
             <w:r/>
@@ -11957,6 +12336,7 @@
           </w:tcPr>
           <w:p>
             <w:pPr>
+              <w:keepNext/>
               <w:spacing w:after="20" w:line="240" w:lineRule="auto"/>
             </w:pPr>
             <w:r/>
@@ -11975,6 +12355,7 @@
           </w:tcPr>
           <w:p>
             <w:pPr>
+              <w:keepNext/>
               <w:spacing w:after="20" w:line="240" w:lineRule="auto"/>
             </w:pPr>
             <w:r/>
@@ -11993,6 +12374,7 @@
           </w:tcPr>
           <w:p>
             <w:pPr>
+              <w:keepNext/>
               <w:spacing w:after="20" w:line="240" w:lineRule="auto"/>
             </w:pPr>
             <w:r/>
@@ -12015,6 +12397,7 @@
           </w:tcPr>
           <w:p>
             <w:pPr>
+              <w:keepNext/>
               <w:spacing w:after="20" w:line="240" w:lineRule="auto"/>
             </w:pPr>
             <w:r/>
@@ -12032,6 +12415,7 @@
           </w:tcPr>
           <w:p>
             <w:pPr>
+              <w:keepNext/>
               <w:spacing w:after="20" w:line="240" w:lineRule="auto"/>
             </w:pPr>
             <w:r/>
@@ -12049,6 +12433,7 @@
           </w:tcPr>
           <w:p>
             <w:pPr>
+              <w:keepNext/>
               <w:spacing w:after="20" w:line="240" w:lineRule="auto"/>
             </w:pPr>
             <w:r/>
@@ -12066,6 +12451,7 @@
           </w:tcPr>
           <w:p>
             <w:pPr>
+              <w:keepNext/>
               <w:spacing w:after="20" w:line="240" w:lineRule="auto"/>
             </w:pPr>
             <w:r/>
@@ -12083,6 +12469,7 @@
           </w:tcPr>
           <w:p>
             <w:pPr>
+              <w:keepNext/>
               <w:spacing w:after="20" w:line="240" w:lineRule="auto"/>
             </w:pPr>
             <w:r/>
@@ -12100,6 +12487,7 @@
           </w:tcPr>
           <w:p>
             <w:pPr>
+              <w:keepNext/>
               <w:spacing w:after="20" w:line="240" w:lineRule="auto"/>
             </w:pPr>
             <w:r/>
@@ -12117,6 +12505,7 @@
           </w:tcPr>
           <w:p>
             <w:pPr>
+              <w:keepNext/>
               <w:spacing w:after="20" w:line="240" w:lineRule="auto"/>
             </w:pPr>
             <w:r/>
@@ -12280,7 +12669,7 @@
         <w:jc w:val="both"/>
       </w:pPr>
       <w:r>
-        <w:t xml:space="preserve">on the untouched test set the MLP reaches </w:t>
+        <w:t xml:space="preserve">On the untouched test set the MLP reaches </w:t>
       </w:r>
       <w:r>
         <w:rPr>
@@ -12471,6 +12860,7 @@
           </w:tcPr>
           <w:p>
             <w:pPr>
+              <w:keepNext/>
               <w:spacing w:after="20" w:line="240" w:lineRule="auto"/>
             </w:pPr>
             <w:r>
@@ -12496,6 +12886,7 @@
           </w:tcPr>
           <w:p>
             <w:pPr>
+              <w:keepNext/>
               <w:spacing w:after="20" w:line="240" w:lineRule="auto"/>
             </w:pPr>
             <w:r>
@@ -12521,6 +12912,7 @@
           </w:tcPr>
           <w:p>
             <w:pPr>
+              <w:keepNext/>
               <w:spacing w:after="20" w:line="240" w:lineRule="auto"/>
             </w:pPr>
             <w:r>
@@ -12550,6 +12942,7 @@
           </w:tcPr>
           <w:p>
             <w:pPr>
+              <w:keepNext/>
               <w:spacing w:after="20" w:line="240" w:lineRule="auto"/>
             </w:pPr>
             <w:r/>
@@ -12567,6 +12960,7 @@
           </w:tcPr>
           <w:p>
             <w:pPr>
+              <w:keepNext/>
               <w:spacing w:after="20" w:line="240" w:lineRule="auto"/>
             </w:pPr>
             <w:r/>
@@ -12584,6 +12978,7 @@
           </w:tcPr>
           <w:p>
             <w:pPr>
+              <w:keepNext/>
               <w:spacing w:after="20" w:line="240" w:lineRule="auto"/>
             </w:pPr>
             <w:r/>
@@ -20599,6 +20994,12 @@
     <w:sectPr>
       <w:pgSz w:w="11906" w:h="16838"/>
       <w:pgMar w:top="1304" w:right="1247" w:bottom="1134" w:left="1247" w:header="720" w:footer="720" w:gutter="0"/>
+      <w:pgBorders w:offsetFrom="page">
+        <w:top w:val="single" w:sz="6" w:space="24" w:color="000000"/>
+        <w:left w:val="single" w:sz="6" w:space="24" w:color="000000"/>
+        <w:bottom w:val="single" w:sz="6" w:space="24" w:color="000000"/>
+        <w:right w:val="single" w:sz="6" w:space="24" w:color="000000"/>
+      </w:pgBorders>
       <w:cols w:space="720"/>
       <w:docGrid w:linePitch="360"/>
     </w:sectPr>

</xml_diff>